<commit_message>
Seed plan: start first sowing on 10/21
Co-Authored-By: Claude Opus 5.5 <noreply@anthropic.com>
Claude-Session: https://claude.ai/code/session_01WoXupqmjxj9Nb3LpX7kcSi
</commit_message>
<xml_diff>
--- a/planning/種子保管・播種計画_2026.docx
+++ b/planning/種子保管・播種計画_2026.docx
@@ -32,7 +32,7 @@
           <w:sz w:val="19"/>
           <w:szCs w:val="19"/>
         </w:rPr>
-        <w:t xml:space="preserve">対象期間：2026年10月15日〜12月20日　／　作成日：2026年10月15日</w:t>
+        <w:t xml:space="preserve">対象期間：2026年10月15日〜12月28日　／　更新日：2026年10月16日</w:t>
       </w:r>
     </w:p>
     <w:p>
@@ -99,13 +99,13 @@
           <w:b/>
           <w:bCs/>
         </w:rPr>
-        <w:t xml:space="preserve">10/17（土）〜12/28（月）</w:t>
+        <w:t xml:space="preserve">10/21（水）〜12/28（月）</w:t>
       </w:r>
       <w:r>
         <w:rPr>
           <w:rFonts w:ascii="Arial" w:eastAsia="Yu Gothic" w:hAnsi="Arial"/>
         </w:rPr>
-        <w:t xml:space="preserve">。完了日はGhana 2・3の到着日で決まるため、Ghana 0（745 kg）を加えても変わりません。</w:t>
+        <w:t xml:space="preserve">。完了日はGhana 2・3の到着日で決まるため、播種開始を10/21に遅らせても変わりません。</w:t>
       </w:r>
     </w:p>
     <w:p>
@@ -129,13 +129,13 @@
           <w:b/>
           <w:bCs/>
         </w:rPr>
-        <w:t xml:space="preserve">17,580 kg（11/14〜11/15）</w:t>
+        <w:t xml:space="preserve">18,720 kg（11/14〜11/15）</w:t>
       </w:r>
       <w:r>
         <w:rPr>
           <w:rFonts w:ascii="Arial" w:eastAsia="Yu Gothic" w:hAnsi="Arial"/>
         </w:rPr>
-        <w:t xml:space="preserve">。Ghana 1の播種中（残り1,880 kg）に、Ghana 3（11/13）とGhana 2（11/14）が続けて到着するためです。</w:t>
+        <w:t xml:space="preserve">。Indiaの播種中（残り1,020 kg）とGhana 1（3,000 kg）が残っているところに、Ghana 3（11/13）とGhana 2（11/14）が続けて到着するためです。</w:t>
       </w:r>
     </w:p>
     <w:p>
@@ -151,7 +151,7 @@
         <w:rPr>
           <w:rFonts w:ascii="Arial" w:eastAsia="Yu Gothic" w:hAnsi="Arial"/>
         </w:rPr>
-        <w:t xml:space="preserve">種子不足（播種できない作業日）：</w:t>
+        <w:t xml:space="preserve">種子不足：</w:t>
       </w:r>
       <w:r>
         <w:rPr>
@@ -159,13 +159,13 @@
           <w:b/>
           <w:bCs/>
         </w:rPr>
-        <w:t xml:space="preserve">11/20（金）・11/21（土）</w:t>
+        <w:t xml:space="preserve">ほぼなし</w:t>
       </w:r>
       <w:r>
         <w:rPr>
           <w:rFonts w:ascii="Arial" w:eastAsia="Yu Gothic" w:hAnsi="Arial"/>
         </w:rPr>
-        <w:t xml:space="preserve">。他に10/23と11/19は一部のみ播種。合計で1,460 kg分（約2.6作業日分）の作業能力が空きます。Ghana 0がIndia前の空き（10/22〜10/23）をほぼ埋めています。</w:t>
+        <w:t xml:space="preserve">。播種開始後に種子が足りなくなるのは11/21（土）の60 kgだけです（Ghana 1が終わり、Ghana 2は翌日から播種可能）。10/21〜12/28は途切れずに播種できます。</w:t>
       </w:r>
     </w:p>
     <w:p>
@@ -181,7 +181,7 @@
         <w:rPr>
           <w:rFonts w:ascii="Arial" w:eastAsia="Yu Gothic" w:hAnsi="Arial"/>
         </w:rPr>
-        <w:t xml:space="preserve">倉庫には、乾燥場所を含めて少なくとも18トン分の保管スペースを確保することを推奨します。</w:t>
+        <w:t xml:space="preserve">倉庫には、乾燥場所を含めて少なくとも19トン分の保管スペースを確保することを推奨します。</w:t>
       </w:r>
     </w:p>
     <w:p>
@@ -258,7 +258,7 @@
         <w:rPr>
           <w:rFonts w:ascii="Arial" w:eastAsia="Yu Gothic" w:hAnsi="Arial"/>
         </w:rPr>
-        <w:t xml:space="preserve">既存のRibáuè 2026・2025・Ghana 0は乾燥済みとし、10/16（金）に準備・浸水、10/17（土）から播種を開始。</w:t>
+        <w:t xml:space="preserve">最初の播種は10/21（水）。既存のRibáuè 2026・2025・Ghana 0は乾燥済みとし、10/20（火）に準備・浸水します。</w:t>
       </w:r>
     </w:p>
     <w:p>
@@ -762,7 +762,7 @@
                 <w:sz w:val="18"/>
                 <w:szCs w:val="18"/>
               </w:rPr>
-              <w:t xml:space="preserve">10/16</w:t>
+              <w:t xml:space="preserve">10/20</w:t>
             </w:r>
           </w:p>
         </w:tc>
@@ -794,7 +794,7 @@
                 <w:sz w:val="18"/>
                 <w:szCs w:val="18"/>
               </w:rPr>
-              <w:t xml:space="preserve">10/17</w:t>
+              <w:t xml:space="preserve">10/21</w:t>
             </w:r>
           </w:p>
         </w:tc>
@@ -826,7 +826,7 @@
                 <w:sz w:val="18"/>
                 <w:szCs w:val="18"/>
               </w:rPr>
-              <w:t xml:space="preserve">10/17〜10/20</w:t>
+              <w:t xml:space="preserve">10/21〜10/23</w:t>
             </w:r>
           </w:p>
         </w:tc>
@@ -1020,7 +1020,7 @@
                 <w:sz w:val="18"/>
                 <w:szCs w:val="18"/>
               </w:rPr>
-              <w:t xml:space="preserve">10/16</w:t>
+              <w:t xml:space="preserve">10/20</w:t>
             </w:r>
           </w:p>
         </w:tc>
@@ -1052,7 +1052,7 @@
                 <w:sz w:val="18"/>
                 <w:szCs w:val="18"/>
               </w:rPr>
-              <w:t xml:space="preserve">10/17</w:t>
+              <w:t xml:space="preserve">10/21</w:t>
             </w:r>
           </w:p>
         </w:tc>
@@ -1084,7 +1084,7 @@
                 <w:sz w:val="18"/>
                 <w:szCs w:val="18"/>
               </w:rPr>
-              <w:t xml:space="preserve">10/20〜10/22</w:t>
+              <w:t xml:space="preserve">10/23〜10/26</w:t>
             </w:r>
           </w:p>
         </w:tc>
@@ -1278,7 +1278,7 @@
                 <w:sz w:val="18"/>
                 <w:szCs w:val="18"/>
               </w:rPr>
-              <w:t xml:space="preserve">10/16</w:t>
+              <w:t xml:space="preserve">10/20</w:t>
             </w:r>
           </w:p>
         </w:tc>
@@ -1310,7 +1310,7 @@
                 <w:sz w:val="18"/>
                 <w:szCs w:val="18"/>
               </w:rPr>
-              <w:t xml:space="preserve">10/17</w:t>
+              <w:t xml:space="preserve">10/21</w:t>
             </w:r>
           </w:p>
         </w:tc>
@@ -1342,7 +1342,7 @@
                 <w:sz w:val="18"/>
                 <w:szCs w:val="18"/>
               </w:rPr>
-              <w:t xml:space="preserve">10/22〜10/23</w:t>
+              <w:t xml:space="preserve">10/26〜10/27</w:t>
             </w:r>
           </w:p>
         </w:tc>
@@ -1600,7 +1600,7 @@
                 <w:sz w:val="18"/>
                 <w:szCs w:val="18"/>
               </w:rPr>
-              <w:t xml:space="preserve">10/24〜11/12</w:t>
+              <w:t xml:space="preserve">10/27〜11/16</w:t>
             </w:r>
           </w:p>
         </w:tc>
@@ -1858,7 +1858,7 @@
                 <w:sz w:val="18"/>
                 <w:szCs w:val="18"/>
               </w:rPr>
-              <w:t xml:space="preserve">11/12〜11/19</w:t>
+              <w:t xml:space="preserve">11/16〜11/21</w:t>
             </w:r>
           </w:p>
         </w:tc>
@@ -2423,7 +2423,7 @@
           <w:sz w:val="18"/>
           <w:szCs w:val="18"/>
         </w:rPr>
-        <w:t xml:space="preserve">※ Ghana 1は10/29から播種可能ですが、India終了後の11/12からの播種です。Ghana 3は11/21から播種可能ですが、Ghana 2の後（12/18〜）の播種です。</w:t>
+        <w:t xml:space="preserve">※ Indiaは10/24から、Ghana 1は10/29から、Ghana 3は11/21から播種可能ですが、指定の順番に従い、それぞれ10/27、11/16、12/18からの播種です。</w:t>
       </w:r>
     </w:p>
     <w:p>
@@ -2501,7 +2501,7 @@
           <w:sz w:val="18"/>
           <w:szCs w:val="18"/>
         </w:rPr>
-        <w:t xml:space="preserve">図1　種類別の保管量（各日の播種後）。薄い赤の帯は、作業日なのに播種できる種子が足りない日。日曜日は播種しないため、保管量が前日と同じになります。</w:t>
+        <w:t xml:space="preserve">図1　種類別の保管量（各日の播種後）。点線は播種開始日（10/21）。薄い赤の帯は、作業日なのに播種できる種子が足りない日。日曜日は播種しないため、保管量が前日と同じになります。</w:t>
       </w:r>
     </w:p>
     <w:p>
@@ -2768,7 +2768,7 @@
                 <w:sz w:val="18"/>
                 <w:szCs w:val="18"/>
               </w:rPr>
-              <w:t xml:space="preserve">10/16</w:t>
+              <w:t xml:space="preserve">10/16〜10/20</w:t>
             </w:r>
           </w:p>
         </w:tc>
@@ -2832,7 +2832,7 @@
                 <w:sz w:val="18"/>
                 <w:szCs w:val="18"/>
               </w:rPr>
-              <w:t xml:space="preserve">India 8,400 kg 到着（乾燥開始）</w:t>
+              <w:t xml:space="preserve">India 8,400 kg 到着（乾燥開始）。播種前（10/20に既存分の準備・浸水）</w:t>
             </w:r>
           </w:p>
         </w:tc>
@@ -2866,7 +2866,7 @@
                 <w:sz w:val="18"/>
                 <w:szCs w:val="18"/>
               </w:rPr>
-              <w:t xml:space="preserve">10/17〜10/20</w:t>
+              <w:t xml:space="preserve">10/21</w:t>
             </w:r>
           </w:p>
         </w:tc>
@@ -2898,7 +2898,7 @@
                 <w:sz w:val="18"/>
                 <w:szCs w:val="18"/>
               </w:rPr>
-              <w:t xml:space="preserve">10,940 → 9,820</w:t>
+              <w:t xml:space="preserve">13,660</w:t>
             </w:r>
           </w:p>
         </w:tc>
@@ -2930,7 +2930,7 @@
                 <w:sz w:val="18"/>
                 <w:szCs w:val="18"/>
               </w:rPr>
-              <w:t xml:space="preserve">Ribáuè 2026 を播種（10/18は日曜休み）</w:t>
+              <w:t xml:space="preserve">Ghana 1 3,000 kg 到着。播種開始（Ribáuè 2026）</w:t>
             </w:r>
           </w:p>
         </w:tc>
@@ -2964,7 +2964,7 @@
                 <w:sz w:val="18"/>
                 <w:szCs w:val="18"/>
               </w:rPr>
-              <w:t xml:space="preserve">10/21</w:t>
+              <w:t xml:space="preserve">10/22〜10/26</w:t>
             </w:r>
           </w:p>
         </w:tc>
@@ -2996,7 +2996,7 @@
                 <w:sz w:val="18"/>
                 <w:szCs w:val="18"/>
               </w:rPr>
-              <w:t xml:space="preserve">12,260</w:t>
+              <w:t xml:space="preserve">13,100 → 11,700</w:t>
             </w:r>
           </w:p>
         </w:tc>
@@ -3028,7 +3028,7 @@
                 <w:sz w:val="18"/>
                 <w:szCs w:val="18"/>
               </w:rPr>
-              <w:t xml:space="preserve">Ghana 1 3,000 kg 到着。Ribáuè 2025 を播種</w:t>
+              <w:t xml:space="preserve">Ribáuè 2026（10/23終了）、Ribáuè 2025（10/26終了）を播種。続けてGhana 0 を開始</w:t>
             </w:r>
           </w:p>
         </w:tc>
@@ -3062,7 +3062,7 @@
                 <w:sz w:val="18"/>
                 <w:szCs w:val="18"/>
               </w:rPr>
-              <w:t xml:space="preserve">10/22〜10/23</w:t>
+              <w:t xml:space="preserve">10/27</w:t>
             </w:r>
           </w:p>
         </w:tc>
@@ -3094,7 +3094,7 @@
                 <w:sz w:val="18"/>
                 <w:szCs w:val="18"/>
               </w:rPr>
-              <w:t xml:space="preserve">11,700 → 11,400</w:t>
+              <w:t xml:space="preserve">11,140</w:t>
             </w:r>
           </w:p>
         </w:tc>
@@ -3126,7 +3126,7 @@
                 <w:sz w:val="18"/>
                 <w:szCs w:val="18"/>
               </w:rPr>
-              <w:t xml:space="preserve">Ribáuè 2025 が10/22で終了。続けてGhana 0 を播種し10/23で終了</w:t>
+              <w:t xml:space="preserve">Ghana 0 が終了し、India を開始</w:t>
             </w:r>
           </w:p>
         </w:tc>
@@ -3160,7 +3160,7 @@
                 <w:sz w:val="18"/>
                 <w:szCs w:val="18"/>
               </w:rPr>
-              <w:t xml:space="preserve">10/24〜11/12</w:t>
+              <w:t xml:space="preserve">10/28〜11/12</w:t>
             </w:r>
           </w:p>
         </w:tc>
@@ -3192,7 +3192,7 @@
                 <w:sz w:val="18"/>
                 <w:szCs w:val="18"/>
               </w:rPr>
-              <w:t xml:space="preserve">11,120 → 2,720</w:t>
+              <w:t xml:space="preserve">10,580 → 3,860</w:t>
             </w:r>
           </w:p>
         </w:tc>
@@ -3290,7 +3290,7 @@
                 <w:sz w:val="18"/>
                 <w:szCs w:val="18"/>
               </w:rPr>
-              <w:t xml:space="preserve">5,860</w:t>
+              <w:t xml:space="preserve">7,000</w:t>
             </w:r>
           </w:p>
         </w:tc>
@@ -3322,7 +3322,7 @@
                 <w:sz w:val="18"/>
                 <w:szCs w:val="18"/>
               </w:rPr>
-              <w:t xml:space="preserve">Ghana 3 3,700 kg 到着。Ghana 1 を播種</w:t>
+              <w:t xml:space="preserve">Ghana 3 3,700 kg 到着</w:t>
             </w:r>
           </w:p>
         </w:tc>
@@ -3388,7 +3388,7 @@
                 <w:sz w:val="18"/>
                 <w:szCs w:val="18"/>
               </w:rPr>
-              <w:t xml:space="preserve">17,580</w:t>
+              <w:t xml:space="preserve">18,720</w:t>
             </w:r>
           </w:p>
         </w:tc>
@@ -3454,7 +3454,7 @@
                 <w:sz w:val="18"/>
                 <w:szCs w:val="18"/>
               </w:rPr>
-              <w:t xml:space="preserve">11/16〜11/19</w:t>
+              <w:t xml:space="preserve">11/16〜11/21</w:t>
             </w:r>
           </w:p>
         </w:tc>
@@ -3486,7 +3486,7 @@
                 <w:sz w:val="18"/>
                 <w:szCs w:val="18"/>
               </w:rPr>
-              <w:t xml:space="preserve">17,020 → 15,700</w:t>
+              <w:t xml:space="preserve">18,160 → 15,700</w:t>
             </w:r>
           </w:p>
         </w:tc>
@@ -3518,7 +3518,7 @@
                 <w:sz w:val="18"/>
                 <w:szCs w:val="18"/>
               </w:rPr>
-              <w:t xml:space="preserve">Ghana 1 を播種し、11/19で終了</w:t>
+              <w:t xml:space="preserve">India が11/16で終了。Ghana 1 を播種し11/21で終了</w:t>
             </w:r>
           </w:p>
         </w:tc>
@@ -3552,7 +3552,7 @@
                 <w:sz w:val="18"/>
                 <w:szCs w:val="18"/>
               </w:rPr>
-              <w:t xml:space="preserve">11/20〜11/22</w:t>
+              <w:t xml:space="preserve">11/22</w:t>
             </w:r>
           </w:p>
         </w:tc>
@@ -3616,7 +3616,7 @@
                 <w:sz w:val="18"/>
                 <w:szCs w:val="18"/>
               </w:rPr>
-              <w:t xml:space="preserve">Ghana 2・3 が乾燥・浸水中で播種なし</w:t>
+              <w:t xml:space="preserve">日曜日</w:t>
             </w:r>
           </w:p>
         </w:tc>
@@ -4019,7 +4019,7 @@
                 <w:sz w:val="18"/>
                 <w:szCs w:val="18"/>
               </w:rPr>
-              <w:t xml:space="preserve">10/23（金）</w:t>
+              <w:t xml:space="preserve">11/21（土）</w:t>
             </w:r>
           </w:p>
         </w:tc>
@@ -4051,7 +4051,7 @@
                 <w:sz w:val="18"/>
                 <w:szCs w:val="18"/>
               </w:rPr>
-              <w:t xml:space="preserve">300</w:t>
+              <w:t xml:space="preserve">220</w:t>
             </w:r>
           </w:p>
         </w:tc>
@@ -4083,7 +4083,7 @@
                 <w:sz w:val="18"/>
                 <w:szCs w:val="18"/>
               </w:rPr>
-              <w:t xml:space="preserve">260</w:t>
+              <w:t xml:space="preserve">60</w:t>
             </w:r>
           </w:p>
         </w:tc>
@@ -4115,7 +4115,7 @@
                 <w:sz w:val="18"/>
                 <w:szCs w:val="18"/>
               </w:rPr>
-              <w:t xml:space="preserve">Ghana 0が終了。Indiaは準備・浸水日（10/24から可）</w:t>
+              <w:t xml:space="preserve">Ghana 1が終了。Ghana 2は11/22から播種可能（11/23から播種）</w:t>
             </w:r>
           </w:p>
         </w:tc>
@@ -4130,6 +4130,7 @@
               <w:bottom w:val="single" w:color="BBBBBB" w:sz="4"/>
               <w:right w:val="single" w:color="BBBBBB" w:sz="4"/>
             </w:tcBorders>
+            <w:shd w:fill="F2F2F2" w:color="auto" w:val="clear"/>
             <w:tcMar>
               <w:top w:type="dxa" w:w="40"/>
               <w:left w:type="dxa" w:w="80"/>
@@ -4149,7 +4150,7 @@
                 <w:sz w:val="18"/>
                 <w:szCs w:val="18"/>
               </w:rPr>
-              <w:t xml:space="preserve">11/19（木）</w:t>
+              <w:t xml:space="preserve">合計</w:t>
             </w:r>
           </w:p>
         </w:tc>
@@ -4162,16 +4163,17 @@
               <w:bottom w:val="single" w:color="BBBBBB" w:sz="4"/>
               <w:right w:val="single" w:color="BBBBBB" w:sz="4"/>
             </w:tcBorders>
-            <w:tcMar>
-              <w:top w:type="dxa" w:w="40"/>
-              <w:left w:type="dxa" w:w="80"/>
-              <w:bottom w:type="dxa" w:w="40"/>
-              <w:right w:type="dxa" w:w="80"/>
-            </w:tcMar>
-          </w:tcPr>
-          <w:p>
-            <w:pPr>
-              <w:jc w:val="right"/>
+            <w:shd w:fill="F2F2F2" w:color="auto" w:val="clear"/>
+            <w:tcMar>
+              <w:top w:type="dxa" w:w="40"/>
+              <w:left w:type="dxa" w:w="80"/>
+              <w:bottom w:type="dxa" w:w="40"/>
+              <w:right w:type="dxa" w:w="80"/>
+            </w:tcMar>
+          </w:tcPr>
+          <w:p>
+            <w:pPr>
+              <w:jc w:val="left"/>
             </w:pPr>
             <w:r>
               <w:rPr>
@@ -4181,7 +4183,7 @@
                 <w:sz w:val="18"/>
                 <w:szCs w:val="18"/>
               </w:rPr>
-              <w:t xml:space="preserve">200</w:t>
+              <w:t xml:space="preserve"/>
             </w:r>
           </w:p>
         </w:tc>
@@ -4194,6 +4196,7 @@
               <w:bottom w:val="single" w:color="BBBBBB" w:sz="4"/>
               <w:right w:val="single" w:color="BBBBBB" w:sz="4"/>
             </w:tcBorders>
+            <w:shd w:fill="F2F2F2" w:color="auto" w:val="clear"/>
             <w:tcMar>
               <w:top w:type="dxa" w:w="40"/>
               <w:left w:type="dxa" w:w="80"/>
@@ -4213,7 +4216,7 @@
                 <w:sz w:val="18"/>
                 <w:szCs w:val="18"/>
               </w:rPr>
-              <w:t xml:space="preserve">360</w:t>
+              <w:t xml:space="preserve">60</w:t>
             </w:r>
           </w:p>
         </w:tc>
@@ -4226,6 +4229,7 @@
               <w:bottom w:val="single" w:color="BBBBBB" w:sz="4"/>
               <w:right w:val="single" w:color="BBBBBB" w:sz="4"/>
             </w:tcBorders>
+            <w:shd w:fill="F2F2F2" w:color="auto" w:val="clear"/>
             <w:tcMar>
               <w:top w:type="dxa" w:w="40"/>
               <w:left w:type="dxa" w:w="80"/>
@@ -4245,276 +4249,26 @@
                 <w:sz w:val="18"/>
                 <w:szCs w:val="18"/>
               </w:rPr>
-              <w:t xml:space="preserve">Ghana 1が終了。Ghana 2・3は乾燥中</w:t>
-            </w:r>
-          </w:p>
-        </w:tc>
-      </w:tr>
-      <w:tr>
-        <w:tc>
-          <w:tcPr>
-            <w:tcW w:type="dxa" w:w="2000"/>
-            <w:tcBorders>
-              <w:top w:val="single" w:color="BBBBBB" w:sz="4"/>
-              <w:left w:val="single" w:color="BBBBBB" w:sz="4"/>
-              <w:bottom w:val="single" w:color="BBBBBB" w:sz="4"/>
-              <w:right w:val="single" w:color="BBBBBB" w:sz="4"/>
-            </w:tcBorders>
-            <w:tcMar>
-              <w:top w:type="dxa" w:w="40"/>
-              <w:left w:type="dxa" w:w="80"/>
-              <w:bottom w:type="dxa" w:w="40"/>
-              <w:right w:type="dxa" w:w="80"/>
-            </w:tcMar>
-          </w:tcPr>
-          <w:p>
-            <w:pPr>
-              <w:jc w:val="left"/>
-            </w:pPr>
-            <w:r>
-              <w:rPr>
-                <w:rFonts w:ascii="Arial" w:eastAsia="Yu Gothic" w:hAnsi="Arial"/>
-                <w:b w:val="false"/>
-                <w:bCs w:val="false"/>
-                <w:sz w:val="18"/>
-                <w:szCs w:val="18"/>
-              </w:rPr>
-              <w:t xml:space="preserve">11/20（金）〜11/21（土）</w:t>
-            </w:r>
-          </w:p>
-        </w:tc>
-        <w:tc>
-          <w:tcPr>
-            <w:tcW w:type="dxa" w:w="1300"/>
-            <w:tcBorders>
-              <w:top w:val="single" w:color="BBBBBB" w:sz="4"/>
-              <w:left w:val="single" w:color="BBBBBB" w:sz="4"/>
-              <w:bottom w:val="single" w:color="BBBBBB" w:sz="4"/>
-              <w:right w:val="single" w:color="BBBBBB" w:sz="4"/>
-            </w:tcBorders>
-            <w:tcMar>
-              <w:top w:type="dxa" w:w="40"/>
-              <w:left w:type="dxa" w:w="80"/>
-              <w:bottom w:type="dxa" w:w="40"/>
-              <w:right w:type="dxa" w:w="80"/>
-            </w:tcMar>
-          </w:tcPr>
-          <w:p>
-            <w:pPr>
-              <w:jc w:val="right"/>
-            </w:pPr>
-            <w:r>
-              <w:rPr>
-                <w:rFonts w:ascii="Arial" w:eastAsia="Yu Gothic" w:hAnsi="Arial"/>
-                <w:b w:val="false"/>
-                <w:bCs w:val="false"/>
-                <w:sz w:val="18"/>
-                <w:szCs w:val="18"/>
-              </w:rPr>
-              <w:t xml:space="preserve">0</w:t>
-            </w:r>
-          </w:p>
-        </w:tc>
-        <w:tc>
-          <w:tcPr>
-            <w:tcW w:type="dxa" w:w="1300"/>
-            <w:tcBorders>
-              <w:top w:val="single" w:color="BBBBBB" w:sz="4"/>
-              <w:left w:val="single" w:color="BBBBBB" w:sz="4"/>
-              <w:bottom w:val="single" w:color="BBBBBB" w:sz="4"/>
-              <w:right w:val="single" w:color="BBBBBB" w:sz="4"/>
-            </w:tcBorders>
-            <w:tcMar>
-              <w:top w:type="dxa" w:w="40"/>
-              <w:left w:type="dxa" w:w="80"/>
-              <w:bottom w:type="dxa" w:w="40"/>
-              <w:right w:type="dxa" w:w="80"/>
-            </w:tcMar>
-          </w:tcPr>
-          <w:p>
-            <w:pPr>
-              <w:jc w:val="right"/>
-            </w:pPr>
-            <w:r>
-              <w:rPr>
-                <w:rFonts w:ascii="Arial" w:eastAsia="Yu Gothic" w:hAnsi="Arial"/>
-                <w:b w:val="false"/>
-                <w:bCs w:val="false"/>
-                <w:sz w:val="18"/>
-                <w:szCs w:val="18"/>
-              </w:rPr>
-              <w:t xml:space="preserve">840</w:t>
-            </w:r>
-          </w:p>
-        </w:tc>
-        <w:tc>
-          <w:tcPr>
-            <w:tcW w:type="dxa" w:w="5100"/>
-            <w:tcBorders>
-              <w:top w:val="single" w:color="BBBBBB" w:sz="4"/>
-              <w:left w:val="single" w:color="BBBBBB" w:sz="4"/>
-              <w:bottom w:val="single" w:color="BBBBBB" w:sz="4"/>
-              <w:right w:val="single" w:color="BBBBBB" w:sz="4"/>
-            </w:tcBorders>
-            <w:tcMar>
-              <w:top w:type="dxa" w:w="40"/>
-              <w:left w:type="dxa" w:w="80"/>
-              <w:bottom w:type="dxa" w:w="40"/>
-              <w:right w:type="dxa" w:w="80"/>
-            </w:tcMar>
-          </w:tcPr>
-          <w:p>
-            <w:pPr>
-              <w:jc w:val="left"/>
-            </w:pPr>
-            <w:r>
-              <w:rPr>
-                <w:rFonts w:ascii="Arial" w:eastAsia="Yu Gothic" w:hAnsi="Arial"/>
-                <w:b w:val="false"/>
-                <w:bCs w:val="false"/>
-                <w:sz w:val="18"/>
-                <w:szCs w:val="18"/>
-              </w:rPr>
-              <w:t xml:space="preserve">Ghana 3 の準備・浸水待ち、Ghana 2 は11/22から可（指定順ではGhana 2が先）</w:t>
-            </w:r>
-          </w:p>
-        </w:tc>
-      </w:tr>
-      <w:tr>
-        <w:tc>
-          <w:tcPr>
-            <w:tcW w:type="dxa" w:w="2000"/>
-            <w:tcBorders>
-              <w:top w:val="single" w:color="BBBBBB" w:sz="4"/>
-              <w:left w:val="single" w:color="BBBBBB" w:sz="4"/>
-              <w:bottom w:val="single" w:color="BBBBBB" w:sz="4"/>
-              <w:right w:val="single" w:color="BBBBBB" w:sz="4"/>
-            </w:tcBorders>
-            <w:shd w:fill="F2F2F2" w:color="auto" w:val="clear"/>
-            <w:tcMar>
-              <w:top w:type="dxa" w:w="40"/>
-              <w:left w:type="dxa" w:w="80"/>
-              <w:bottom w:type="dxa" w:w="40"/>
-              <w:right w:type="dxa" w:w="80"/>
-            </w:tcMar>
-          </w:tcPr>
-          <w:p>
-            <w:pPr>
-              <w:jc w:val="left"/>
-            </w:pPr>
-            <w:r>
-              <w:rPr>
-                <w:rFonts w:ascii="Arial" w:eastAsia="Yu Gothic" w:hAnsi="Arial"/>
-                <w:b w:val="false"/>
-                <w:bCs w:val="false"/>
-                <w:sz w:val="18"/>
-                <w:szCs w:val="18"/>
-              </w:rPr>
-              <w:t xml:space="preserve">合計</w:t>
-            </w:r>
-          </w:p>
-        </w:tc>
-        <w:tc>
-          <w:tcPr>
-            <w:tcW w:type="dxa" w:w="1300"/>
-            <w:tcBorders>
-              <w:top w:val="single" w:color="BBBBBB" w:sz="4"/>
-              <w:left w:val="single" w:color="BBBBBB" w:sz="4"/>
-              <w:bottom w:val="single" w:color="BBBBBB" w:sz="4"/>
-              <w:right w:val="single" w:color="BBBBBB" w:sz="4"/>
-            </w:tcBorders>
-            <w:shd w:fill="F2F2F2" w:color="auto" w:val="clear"/>
-            <w:tcMar>
-              <w:top w:type="dxa" w:w="40"/>
-              <w:left w:type="dxa" w:w="80"/>
-              <w:bottom w:type="dxa" w:w="40"/>
-              <w:right w:type="dxa" w:w="80"/>
-            </w:tcMar>
-          </w:tcPr>
-          <w:p>
-            <w:pPr>
-              <w:jc w:val="left"/>
-            </w:pPr>
-            <w:r>
-              <w:rPr>
-                <w:rFonts w:ascii="Arial" w:eastAsia="Yu Gothic" w:hAnsi="Arial"/>
-                <w:b w:val="false"/>
-                <w:bCs w:val="false"/>
-                <w:sz w:val="18"/>
-                <w:szCs w:val="18"/>
-              </w:rPr>
-              <w:t xml:space="preserve"/>
-            </w:r>
-          </w:p>
-        </w:tc>
-        <w:tc>
-          <w:tcPr>
-            <w:tcW w:type="dxa" w:w="1300"/>
-            <w:tcBorders>
-              <w:top w:val="single" w:color="BBBBBB" w:sz="4"/>
-              <w:left w:val="single" w:color="BBBBBB" w:sz="4"/>
-              <w:bottom w:val="single" w:color="BBBBBB" w:sz="4"/>
-              <w:right w:val="single" w:color="BBBBBB" w:sz="4"/>
-            </w:tcBorders>
-            <w:shd w:fill="F2F2F2" w:color="auto" w:val="clear"/>
-            <w:tcMar>
-              <w:top w:type="dxa" w:w="40"/>
-              <w:left w:type="dxa" w:w="80"/>
-              <w:bottom w:type="dxa" w:w="40"/>
-              <w:right w:type="dxa" w:w="80"/>
-            </w:tcMar>
-          </w:tcPr>
-          <w:p>
-            <w:pPr>
-              <w:jc w:val="right"/>
-            </w:pPr>
-            <w:r>
-              <w:rPr>
-                <w:rFonts w:ascii="Arial" w:eastAsia="Yu Gothic" w:hAnsi="Arial"/>
-                <w:b w:val="false"/>
-                <w:bCs w:val="false"/>
-                <w:sz w:val="18"/>
-                <w:szCs w:val="18"/>
-              </w:rPr>
-              <w:t xml:space="preserve">1,460</w:t>
-            </w:r>
-          </w:p>
-        </w:tc>
-        <w:tc>
-          <w:tcPr>
-            <w:tcW w:type="dxa" w:w="5100"/>
-            <w:tcBorders>
-              <w:top w:val="single" w:color="BBBBBB" w:sz="4"/>
-              <w:left w:val="single" w:color="BBBBBB" w:sz="4"/>
-              <w:bottom w:val="single" w:color="BBBBBB" w:sz="4"/>
-              <w:right w:val="single" w:color="BBBBBB" w:sz="4"/>
-            </w:tcBorders>
-            <w:shd w:fill="F2F2F2" w:color="auto" w:val="clear"/>
-            <w:tcMar>
-              <w:top w:type="dxa" w:w="40"/>
-              <w:left w:type="dxa" w:w="80"/>
-              <w:bottom w:type="dxa" w:w="40"/>
-              <w:right w:type="dxa" w:w="80"/>
-            </w:tcMar>
-          </w:tcPr>
-          <w:p>
-            <w:pPr>
-              <w:jc w:val="left"/>
-            </w:pPr>
-            <w:r>
-              <w:rPr>
-                <w:rFonts w:ascii="Arial" w:eastAsia="Yu Gothic" w:hAnsi="Arial"/>
-                <w:b w:val="false"/>
-                <w:bCs w:val="false"/>
-                <w:sz w:val="18"/>
-                <w:szCs w:val="18"/>
-              </w:rPr>
-              <w:t xml:space="preserve">約2.6作業日分の作業能力</w:t>
+              <w:t xml:space="preserve">ほぼ影響なし</w:t>
             </w:r>
           </w:p>
         </w:tc>
       </w:tr>
     </w:tbl>
+    <w:p>
+      <w:pPr>
+        <w:spacing w:after="100" w:before="80"/>
+      </w:pPr>
+      <w:r>
+        <w:rPr>
+          <w:rFonts w:ascii="Arial" w:eastAsia="Yu Gothic" w:hAnsi="Arial"/>
+          <w:color w:val="555555"/>
+          <w:sz w:val="18"/>
+          <w:szCs w:val="18"/>
+        </w:rPr>
+        <w:t xml:space="preserve">※ 10/15〜10/20は播種開始前のため、不足には含めていません。</w:t>
+      </w:r>
+    </w:p>
     <w:p>
       <w:pPr>
         <w:pStyle w:val="Heading1"/>
@@ -4549,7 +4303,7 @@
         <w:rPr>
           <w:rFonts w:ascii="Arial" w:eastAsia="Yu Gothic" w:hAnsi="Arial"/>
         </w:rPr>
-        <w:t xml:space="preserve">11/23以降はGhana 2・3の15,700 kgを続けて播種するため、前半の空き日を埋めても完了日は早まりません。順番を入れ替えても（Ghana 3を先にしても）完了日は同じです。</w:t>
+        <w:t xml:space="preserve">11/23以降はGhana 2・3の15,700 kgを続けて播種するため、開始日を10/17から10/21に遅らせても完了日は変わりません。その代わり、前回計算であった播種なしの作業日（10/23、11/20〜11/21）がなくなります。</w:t>
       </w:r>
     </w:p>
     <w:p>
@@ -4567,13 +4321,37 @@
           <w:b/>
           <w:bCs/>
         </w:rPr>
-        <w:t xml:space="preserve">空き日の活用：</w:t>
+        <w:t xml:space="preserve">最大保管量が増える：</w:t>
       </w:r>
       <w:r>
         <w:rPr>
           <w:rFonts w:ascii="Arial" w:eastAsia="Yu Gothic" w:hAnsi="Arial"/>
         </w:rPr>
-        <w:t xml:space="preserve">10/23の午後と11/20〜11/21は、植穴掘り・圃場整備・除草、次のロットの浸水準備などに充てられます。</w:t>
+        <w:t xml:space="preserve">播種開始が遅れた分、IndiaとGhana 1の在庫が11月中旬まで残るため、最大保管量は17,580 kgから18,720 kgに増えます（+1,140 kg）。</w:t>
+      </w:r>
+    </w:p>
+    <w:p>
+      <w:pPr>
+        <w:pStyle w:val="ListParagraph"/>
+        <w:numPr>
+          <w:ilvl w:val="0"/>
+          <w:numId w:val="2"/>
+        </w:numPr>
+        <w:spacing w:after="60"/>
+      </w:pPr>
+      <w:r>
+        <w:rPr>
+          <w:rFonts w:ascii="Arial" w:eastAsia="Yu Gothic" w:hAnsi="Arial"/>
+          <w:b/>
+          <w:bCs/>
+        </w:rPr>
+        <w:t xml:space="preserve">播種前の期間：</w:t>
+      </w:r>
+      <w:r>
+        <w:rPr>
+          <w:rFonts w:ascii="Arial" w:eastAsia="Yu Gothic" w:hAnsi="Arial"/>
+        </w:rPr>
+        <w:t xml:space="preserve">10/16〜10/20は、植穴掘り・圃場整備・労働者への説明などの準備に充てられます。</w:t>
       </w:r>
     </w:p>
     <w:p>
@@ -4669,7 +4447,7 @@
         <w:rPr>
           <w:rFonts w:ascii="Arial" w:eastAsia="Yu Gothic" w:hAnsi="Arial"/>
         </w:rPr>
-        <w:t xml:space="preserve">Ghana 1は到着から最長約1か月（〜11/19）、Ghana 3は最長約1.5か月（〜12/28）保管されます。湿気・害虫対策と定期点検を行ってください。</w:t>
+        <w:t xml:space="preserve">Indiaは到着から最長約1か月（〜11/16）、Ghana 1は約1か月（〜11/21）、Ghana 3は約1.5か月（〜12/28）保管されます。湿気・害虫対策と定期点検を行ってください。</w:t>
       </w:r>
     </w:p>
     <w:p>
@@ -5877,7 +5655,7 @@
                 <w:sz w:val="16"/>
                 <w:szCs w:val="16"/>
               </w:rPr>
-              <w:t xml:space="preserve">1,046</w:t>
+              <w:t xml:space="preserve">1,326</w:t>
             </w:r>
           </w:p>
         </w:tc>
@@ -6101,7 +5879,7 @@
                 <w:sz w:val="16"/>
                 <w:szCs w:val="16"/>
               </w:rPr>
-              <w:t xml:space="preserve">10,940</w:t>
+              <w:t xml:space="preserve">11,220</w:t>
             </w:r>
           </w:p>
         </w:tc>
@@ -6133,7 +5911,7 @@
                 <w:sz w:val="16"/>
                 <w:szCs w:val="16"/>
               </w:rPr>
-              <w:t xml:space="preserve">280</w:t>
+              <w:t xml:space="preserve">0</w:t>
             </w:r>
           </w:p>
         </w:tc>
@@ -6155,17 +5933,17 @@
           </w:tcPr>
           <w:p>
             <w:pPr>
-              <w:jc w:val="left"/>
-            </w:pPr>
-            <w:r>
-              <w:rPr>
-                <w:rFonts w:ascii="Arial" w:eastAsia="Yu Gothic" w:hAnsi="Arial"/>
-                <w:b w:val="false"/>
-                <w:bCs w:val="false"/>
-                <w:sz w:val="16"/>
-                <w:szCs w:val="16"/>
-              </w:rPr>
-              <w:t xml:space="preserve">Ribáuè 2026 280</w:t>
+              <w:jc w:val="right"/>
+            </w:pPr>
+            <w:r>
+              <w:rPr>
+                <w:rFonts w:ascii="Arial" w:eastAsia="Yu Gothic" w:hAnsi="Arial"/>
+                <w:b w:val="false"/>
+                <w:bCs w:val="false"/>
+                <w:sz w:val="16"/>
+                <w:szCs w:val="16"/>
+              </w:rPr>
+              <w:t xml:space="preserve">—</w:t>
             </w:r>
           </w:p>
         </w:tc>
@@ -6233,7 +6011,7 @@
                 <w:sz w:val="16"/>
                 <w:szCs w:val="16"/>
               </w:rPr>
-              <w:t xml:space="preserve">1,046</w:t>
+              <w:t xml:space="preserve">1,326</w:t>
             </w:r>
           </w:p>
         </w:tc>
@@ -6464,7 +6242,7 @@
                 <w:sz w:val="16"/>
                 <w:szCs w:val="16"/>
               </w:rPr>
-              <w:t xml:space="preserve">10,940</w:t>
+              <w:t xml:space="preserve">11,220</w:t>
             </w:r>
           </w:p>
         </w:tc>
@@ -6596,7 +6374,7 @@
                 <w:sz w:val="16"/>
                 <w:szCs w:val="16"/>
               </w:rPr>
-              <w:t xml:space="preserve">486</w:t>
+              <w:t xml:space="preserve">1,326</w:t>
             </w:r>
           </w:p>
         </w:tc>
@@ -6820,7 +6598,7 @@
                 <w:sz w:val="16"/>
                 <w:szCs w:val="16"/>
               </w:rPr>
-              <w:t xml:space="preserve">10,380</w:t>
+              <w:t xml:space="preserve">11,220</w:t>
             </w:r>
           </w:p>
         </w:tc>
@@ -6852,7 +6630,7 @@
                 <w:sz w:val="16"/>
                 <w:szCs w:val="16"/>
               </w:rPr>
-              <w:t xml:space="preserve">560</w:t>
+              <w:t xml:space="preserve">0</w:t>
             </w:r>
           </w:p>
         </w:tc>
@@ -6874,17 +6652,17 @@
           </w:tcPr>
           <w:p>
             <w:pPr>
-              <w:jc w:val="left"/>
-            </w:pPr>
-            <w:r>
-              <w:rPr>
-                <w:rFonts w:ascii="Arial" w:eastAsia="Yu Gothic" w:hAnsi="Arial"/>
-                <w:b w:val="false"/>
-                <w:bCs w:val="false"/>
-                <w:sz w:val="16"/>
-                <w:szCs w:val="16"/>
-              </w:rPr>
-              <w:t xml:space="preserve">Ribáuè 2026 560</w:t>
+              <w:jc w:val="right"/>
+            </w:pPr>
+            <w:r>
+              <w:rPr>
+                <w:rFonts w:ascii="Arial" w:eastAsia="Yu Gothic" w:hAnsi="Arial"/>
+                <w:b w:val="false"/>
+                <w:bCs w:val="false"/>
+                <w:sz w:val="16"/>
+                <w:szCs w:val="16"/>
+              </w:rPr>
+              <w:t xml:space="preserve">—</w:t>
             </w:r>
           </w:p>
         </w:tc>
@@ -6950,39 +6728,39 @@
                 <w:sz w:val="16"/>
                 <w:szCs w:val="16"/>
               </w:rPr>
-              <w:t xml:space="preserve">—</w:t>
-            </w:r>
-          </w:p>
-        </w:tc>
-        <w:tc>
-          <w:tcPr>
-            <w:tcW w:type="dxa" w:w="720"/>
-            <w:tcBorders>
-              <w:top w:val="single" w:color="BBBBBB" w:sz="4"/>
-              <w:left w:val="single" w:color="BBBBBB" w:sz="4"/>
-              <w:bottom w:val="single" w:color="BBBBBB" w:sz="4"/>
-              <w:right w:val="single" w:color="BBBBBB" w:sz="4"/>
-            </w:tcBorders>
-            <w:tcMar>
-              <w:top w:type="dxa" w:w="40"/>
-              <w:left w:type="dxa" w:w="80"/>
-              <w:bottom w:type="dxa" w:w="40"/>
-              <w:right w:type="dxa" w:w="80"/>
-            </w:tcMar>
-          </w:tcPr>
-          <w:p>
-            <w:pPr>
-              <w:jc w:val="right"/>
-            </w:pPr>
-            <w:r>
-              <w:rPr>
-                <w:rFonts w:ascii="Arial" w:eastAsia="Yu Gothic" w:hAnsi="Arial"/>
-                <w:b w:val="false"/>
-                <w:bCs w:val="false"/>
-                <w:sz w:val="16"/>
-                <w:szCs w:val="16"/>
-              </w:rPr>
-              <w:t xml:space="preserve">675</w:t>
+              <w:t xml:space="preserve">1,326</w:t>
+            </w:r>
+          </w:p>
+        </w:tc>
+        <w:tc>
+          <w:tcPr>
+            <w:tcW w:type="dxa" w:w="720"/>
+            <w:tcBorders>
+              <w:top w:val="single" w:color="BBBBBB" w:sz="4"/>
+              <w:left w:val="single" w:color="BBBBBB" w:sz="4"/>
+              <w:bottom w:val="single" w:color="BBBBBB" w:sz="4"/>
+              <w:right w:val="single" w:color="BBBBBB" w:sz="4"/>
+            </w:tcBorders>
+            <w:tcMar>
+              <w:top w:type="dxa" w:w="40"/>
+              <w:left w:type="dxa" w:w="80"/>
+              <w:bottom w:type="dxa" w:w="40"/>
+              <w:right w:type="dxa" w:w="80"/>
+            </w:tcMar>
+          </w:tcPr>
+          <w:p>
+            <w:pPr>
+              <w:jc w:val="right"/>
+            </w:pPr>
+            <w:r>
+              <w:rPr>
+                <w:rFonts w:ascii="Arial" w:eastAsia="Yu Gothic" w:hAnsi="Arial"/>
+                <w:b w:val="false"/>
+                <w:bCs w:val="false"/>
+                <w:sz w:val="16"/>
+                <w:szCs w:val="16"/>
+              </w:rPr>
+              <w:t xml:space="preserve">749</w:t>
             </w:r>
           </w:p>
         </w:tc>
@@ -7174,7 +6952,7 @@
                 <w:sz w:val="16"/>
                 <w:szCs w:val="16"/>
               </w:rPr>
-              <w:t xml:space="preserve">9,820</w:t>
+              <w:t xml:space="preserve">11,220</w:t>
             </w:r>
           </w:p>
         </w:tc>
@@ -7206,7 +6984,7 @@
                 <w:sz w:val="16"/>
                 <w:szCs w:val="16"/>
               </w:rPr>
-              <w:t xml:space="preserve">560</w:t>
+              <w:t xml:space="preserve">0</w:t>
             </w:r>
           </w:p>
         </w:tc>
@@ -7228,17 +7006,17 @@
           </w:tcPr>
           <w:p>
             <w:pPr>
-              <w:jc w:val="left"/>
-            </w:pPr>
-            <w:r>
-              <w:rPr>
-                <w:rFonts w:ascii="Arial" w:eastAsia="Yu Gothic" w:hAnsi="Arial"/>
-                <w:b w:val="false"/>
-                <w:bCs w:val="false"/>
-                <w:sz w:val="16"/>
-                <w:szCs w:val="16"/>
-              </w:rPr>
-              <w:t xml:space="preserve">Ribáuè 2026 486 / Ribáuè 2025 74</w:t>
+              <w:jc w:val="right"/>
+            </w:pPr>
+            <w:r>
+              <w:rPr>
+                <w:rFonts w:ascii="Arial" w:eastAsia="Yu Gothic" w:hAnsi="Arial"/>
+                <w:b w:val="false"/>
+                <w:bCs w:val="false"/>
+                <w:sz w:val="16"/>
+                <w:szCs w:val="16"/>
+              </w:rPr>
+              <w:t xml:space="preserve">—</w:t>
             </w:r>
           </w:p>
         </w:tc>
@@ -7304,39 +7082,39 @@
                 <w:sz w:val="16"/>
                 <w:szCs w:val="16"/>
               </w:rPr>
-              <w:t xml:space="preserve">—</w:t>
-            </w:r>
-          </w:p>
-        </w:tc>
-        <w:tc>
-          <w:tcPr>
-            <w:tcW w:type="dxa" w:w="720"/>
-            <w:tcBorders>
-              <w:top w:val="single" w:color="BBBBBB" w:sz="4"/>
-              <w:left w:val="single" w:color="BBBBBB" w:sz="4"/>
-              <w:bottom w:val="single" w:color="BBBBBB" w:sz="4"/>
-              <w:right w:val="single" w:color="BBBBBB" w:sz="4"/>
-            </w:tcBorders>
-            <w:tcMar>
-              <w:top w:type="dxa" w:w="40"/>
-              <w:left w:type="dxa" w:w="80"/>
-              <w:bottom w:type="dxa" w:w="40"/>
-              <w:right w:type="dxa" w:w="80"/>
-            </w:tcMar>
-          </w:tcPr>
-          <w:p>
-            <w:pPr>
-              <w:jc w:val="right"/>
-            </w:pPr>
-            <w:r>
-              <w:rPr>
-                <w:rFonts w:ascii="Arial" w:eastAsia="Yu Gothic" w:hAnsi="Arial"/>
-                <w:b w:val="false"/>
-                <w:bCs w:val="false"/>
-                <w:sz w:val="16"/>
-                <w:szCs w:val="16"/>
-              </w:rPr>
-              <w:t xml:space="preserve">115</w:t>
+              <w:t xml:space="preserve">766</w:t>
+            </w:r>
+          </w:p>
+        </w:tc>
+        <w:tc>
+          <w:tcPr>
+            <w:tcW w:type="dxa" w:w="720"/>
+            <w:tcBorders>
+              <w:top w:val="single" w:color="BBBBBB" w:sz="4"/>
+              <w:left w:val="single" w:color="BBBBBB" w:sz="4"/>
+              <w:bottom w:val="single" w:color="BBBBBB" w:sz="4"/>
+              <w:right w:val="single" w:color="BBBBBB" w:sz="4"/>
+            </w:tcBorders>
+            <w:tcMar>
+              <w:top w:type="dxa" w:w="40"/>
+              <w:left w:type="dxa" w:w="80"/>
+              <w:bottom w:type="dxa" w:w="40"/>
+              <w:right w:type="dxa" w:w="80"/>
+            </w:tcMar>
+          </w:tcPr>
+          <w:p>
+            <w:pPr>
+              <w:jc w:val="right"/>
+            </w:pPr>
+            <w:r>
+              <w:rPr>
+                <w:rFonts w:ascii="Arial" w:eastAsia="Yu Gothic" w:hAnsi="Arial"/>
+                <w:b w:val="false"/>
+                <w:bCs w:val="false"/>
+                <w:sz w:val="16"/>
+                <w:szCs w:val="16"/>
+              </w:rPr>
+              <w:t xml:space="preserve">749</w:t>
             </w:r>
           </w:p>
         </w:tc>
@@ -7528,7 +7306,7 @@
                 <w:sz w:val="16"/>
                 <w:szCs w:val="16"/>
               </w:rPr>
-              <w:t xml:space="preserve">12,260</w:t>
+              <w:t xml:space="preserve">13,660</w:t>
             </w:r>
           </w:p>
         </w:tc>
@@ -7592,7 +7370,7 @@
                 <w:sz w:val="16"/>
                 <w:szCs w:val="16"/>
               </w:rPr>
-              <w:t xml:space="preserve">Ribáuè 2025 560</w:t>
+              <w:t xml:space="preserve">Ribáuè 2026 560</w:t>
             </w:r>
           </w:p>
         </w:tc>
@@ -7658,71 +7436,71 @@
                 <w:sz w:val="16"/>
                 <w:szCs w:val="16"/>
               </w:rPr>
-              <w:t xml:space="preserve">—</w:t>
-            </w:r>
-          </w:p>
-        </w:tc>
-        <w:tc>
-          <w:tcPr>
-            <w:tcW w:type="dxa" w:w="720"/>
-            <w:tcBorders>
-              <w:top w:val="single" w:color="BBBBBB" w:sz="4"/>
-              <w:left w:val="single" w:color="BBBBBB" w:sz="4"/>
-              <w:bottom w:val="single" w:color="BBBBBB" w:sz="4"/>
-              <w:right w:val="single" w:color="BBBBBB" w:sz="4"/>
-            </w:tcBorders>
-            <w:tcMar>
-              <w:top w:type="dxa" w:w="40"/>
-              <w:left w:type="dxa" w:w="80"/>
-              <w:bottom w:type="dxa" w:w="40"/>
-              <w:right w:type="dxa" w:w="80"/>
-            </w:tcMar>
-          </w:tcPr>
-          <w:p>
-            <w:pPr>
-              <w:jc w:val="right"/>
-            </w:pPr>
-            <w:r>
-              <w:rPr>
-                <w:rFonts w:ascii="Arial" w:eastAsia="Yu Gothic" w:hAnsi="Arial"/>
-                <w:b w:val="false"/>
-                <w:bCs w:val="false"/>
-                <w:sz w:val="16"/>
-                <w:szCs w:val="16"/>
-              </w:rPr>
-              <w:t xml:space="preserve">—</w:t>
-            </w:r>
-          </w:p>
-        </w:tc>
-        <w:tc>
-          <w:tcPr>
-            <w:tcW w:type="dxa" w:w="720"/>
-            <w:tcBorders>
-              <w:top w:val="single" w:color="BBBBBB" w:sz="4"/>
-              <w:left w:val="single" w:color="BBBBBB" w:sz="4"/>
-              <w:bottom w:val="single" w:color="BBBBBB" w:sz="4"/>
-              <w:right w:val="single" w:color="BBBBBB" w:sz="4"/>
-            </w:tcBorders>
-            <w:tcMar>
-              <w:top w:type="dxa" w:w="40"/>
-              <w:left w:type="dxa" w:w="80"/>
-              <w:bottom w:type="dxa" w:w="40"/>
-              <w:right w:type="dxa" w:w="80"/>
-            </w:tcMar>
-          </w:tcPr>
-          <w:p>
-            <w:pPr>
-              <w:jc w:val="right"/>
-            </w:pPr>
-            <w:r>
-              <w:rPr>
-                <w:rFonts w:ascii="Arial" w:eastAsia="Yu Gothic" w:hAnsi="Arial"/>
-                <w:b w:val="false"/>
-                <w:bCs w:val="false"/>
-                <w:sz w:val="16"/>
-                <w:szCs w:val="16"/>
-              </w:rPr>
-              <w:t xml:space="preserve">300</w:t>
+              <w:t xml:space="preserve">206</w:t>
+            </w:r>
+          </w:p>
+        </w:tc>
+        <w:tc>
+          <w:tcPr>
+            <w:tcW w:type="dxa" w:w="720"/>
+            <w:tcBorders>
+              <w:top w:val="single" w:color="BBBBBB" w:sz="4"/>
+              <w:left w:val="single" w:color="BBBBBB" w:sz="4"/>
+              <w:bottom w:val="single" w:color="BBBBBB" w:sz="4"/>
+              <w:right w:val="single" w:color="BBBBBB" w:sz="4"/>
+            </w:tcBorders>
+            <w:tcMar>
+              <w:top w:type="dxa" w:w="40"/>
+              <w:left w:type="dxa" w:w="80"/>
+              <w:bottom w:type="dxa" w:w="40"/>
+              <w:right w:type="dxa" w:w="80"/>
+            </w:tcMar>
+          </w:tcPr>
+          <w:p>
+            <w:pPr>
+              <w:jc w:val="right"/>
+            </w:pPr>
+            <w:r>
+              <w:rPr>
+                <w:rFonts w:ascii="Arial" w:eastAsia="Yu Gothic" w:hAnsi="Arial"/>
+                <w:b w:val="false"/>
+                <w:bCs w:val="false"/>
+                <w:sz w:val="16"/>
+                <w:szCs w:val="16"/>
+              </w:rPr>
+              <w:t xml:space="preserve">749</w:t>
+            </w:r>
+          </w:p>
+        </w:tc>
+        <w:tc>
+          <w:tcPr>
+            <w:tcW w:type="dxa" w:w="720"/>
+            <w:tcBorders>
+              <w:top w:val="single" w:color="BBBBBB" w:sz="4"/>
+              <w:left w:val="single" w:color="BBBBBB" w:sz="4"/>
+              <w:bottom w:val="single" w:color="BBBBBB" w:sz="4"/>
+              <w:right w:val="single" w:color="BBBBBB" w:sz="4"/>
+            </w:tcBorders>
+            <w:tcMar>
+              <w:top w:type="dxa" w:w="40"/>
+              <w:left w:type="dxa" w:w="80"/>
+              <w:bottom w:type="dxa" w:w="40"/>
+              <w:right w:type="dxa" w:w="80"/>
+            </w:tcMar>
+          </w:tcPr>
+          <w:p>
+            <w:pPr>
+              <w:jc w:val="right"/>
+            </w:pPr>
+            <w:r>
+              <w:rPr>
+                <w:rFonts w:ascii="Arial" w:eastAsia="Yu Gothic" w:hAnsi="Arial"/>
+                <w:b w:val="false"/>
+                <w:bCs w:val="false"/>
+                <w:sz w:val="16"/>
+                <w:szCs w:val="16"/>
+              </w:rPr>
+              <w:t xml:space="preserve">745</w:t>
             </w:r>
           </w:p>
         </w:tc>
@@ -7882,7 +7660,7 @@
                 <w:sz w:val="16"/>
                 <w:szCs w:val="16"/>
               </w:rPr>
-              <w:t xml:space="preserve">11,700</w:t>
+              <w:t xml:space="preserve">13,100</w:t>
             </w:r>
           </w:p>
         </w:tc>
@@ -7946,7 +7724,7 @@
                 <w:sz w:val="16"/>
                 <w:szCs w:val="16"/>
               </w:rPr>
-              <w:t xml:space="preserve">Ribáuè 2025 115 / Ghana 0 445</w:t>
+              <w:t xml:space="preserve">Ribáuè 2026 560</w:t>
             </w:r>
           </w:p>
         </w:tc>
@@ -7961,7 +7739,6 @@
               <w:bottom w:val="single" w:color="BBBBBB" w:sz="4"/>
               <w:right w:val="single" w:color="BBBBBB" w:sz="4"/>
             </w:tcBorders>
-            <w:shd w:fill="FBE3E3" w:color="auto" w:val="clear"/>
             <w:tcMar>
               <w:top w:type="dxa" w:w="40"/>
               <w:left w:type="dxa" w:w="80"/>
@@ -7994,106 +7771,102 @@
               <w:bottom w:val="single" w:color="BBBBBB" w:sz="4"/>
               <w:right w:val="single" w:color="BBBBBB" w:sz="4"/>
             </w:tcBorders>
-            <w:shd w:fill="FBE3E3" w:color="auto" w:val="clear"/>
-            <w:tcMar>
-              <w:top w:type="dxa" w:w="40"/>
-              <w:left w:type="dxa" w:w="80"/>
-              <w:bottom w:type="dxa" w:w="40"/>
-              <w:right w:type="dxa" w:w="80"/>
-            </w:tcMar>
-          </w:tcPr>
-          <w:p>
-            <w:pPr>
-              <w:jc w:val="right"/>
-            </w:pPr>
-            <w:r>
-              <w:rPr>
-                <w:rFonts w:ascii="Arial" w:eastAsia="Yu Gothic" w:hAnsi="Arial"/>
-                <w:b w:val="false"/>
-                <w:bCs w:val="false"/>
-                <w:sz w:val="16"/>
-                <w:szCs w:val="16"/>
-              </w:rPr>
-              <w:t xml:space="preserve">—</w:t>
-            </w:r>
-          </w:p>
-        </w:tc>
-        <w:tc>
-          <w:tcPr>
-            <w:tcW w:type="dxa" w:w="720"/>
-            <w:tcBorders>
-              <w:top w:val="single" w:color="BBBBBB" w:sz="4"/>
-              <w:left w:val="single" w:color="BBBBBB" w:sz="4"/>
-              <w:bottom w:val="single" w:color="BBBBBB" w:sz="4"/>
-              <w:right w:val="single" w:color="BBBBBB" w:sz="4"/>
-            </w:tcBorders>
-            <w:shd w:fill="FBE3E3" w:color="auto" w:val="clear"/>
-            <w:tcMar>
-              <w:top w:type="dxa" w:w="40"/>
-              <w:left w:type="dxa" w:w="80"/>
-              <w:bottom w:type="dxa" w:w="40"/>
-              <w:right w:type="dxa" w:w="80"/>
-            </w:tcMar>
-          </w:tcPr>
-          <w:p>
-            <w:pPr>
-              <w:jc w:val="right"/>
-            </w:pPr>
-            <w:r>
-              <w:rPr>
-                <w:rFonts w:ascii="Arial" w:eastAsia="Yu Gothic" w:hAnsi="Arial"/>
-                <w:b w:val="false"/>
-                <w:bCs w:val="false"/>
-                <w:sz w:val="16"/>
-                <w:szCs w:val="16"/>
-              </w:rPr>
-              <w:t xml:space="preserve">—</w:t>
-            </w:r>
-          </w:p>
-        </w:tc>
-        <w:tc>
-          <w:tcPr>
-            <w:tcW w:type="dxa" w:w="720"/>
-            <w:tcBorders>
-              <w:top w:val="single" w:color="BBBBBB" w:sz="4"/>
-              <w:left w:val="single" w:color="BBBBBB" w:sz="4"/>
-              <w:bottom w:val="single" w:color="BBBBBB" w:sz="4"/>
-              <w:right w:val="single" w:color="BBBBBB" w:sz="4"/>
-            </w:tcBorders>
-            <w:shd w:fill="FBE3E3" w:color="auto" w:val="clear"/>
-            <w:tcMar>
-              <w:top w:type="dxa" w:w="40"/>
-              <w:left w:type="dxa" w:w="80"/>
-              <w:bottom w:type="dxa" w:w="40"/>
-              <w:right w:type="dxa" w:w="80"/>
-            </w:tcMar>
-          </w:tcPr>
-          <w:p>
-            <w:pPr>
-              <w:jc w:val="right"/>
-            </w:pPr>
-            <w:r>
-              <w:rPr>
-                <w:rFonts w:ascii="Arial" w:eastAsia="Yu Gothic" w:hAnsi="Arial"/>
-                <w:b w:val="false"/>
-                <w:bCs w:val="false"/>
-                <w:sz w:val="16"/>
-                <w:szCs w:val="16"/>
-              </w:rPr>
-              <w:t xml:space="preserve">—</w:t>
-            </w:r>
-          </w:p>
-        </w:tc>
-        <w:tc>
-          <w:tcPr>
-            <w:tcW w:type="dxa" w:w="720"/>
-            <w:tcBorders>
-              <w:top w:val="single" w:color="BBBBBB" w:sz="4"/>
-              <w:left w:val="single" w:color="BBBBBB" w:sz="4"/>
-              <w:bottom w:val="single" w:color="BBBBBB" w:sz="4"/>
-              <w:right w:val="single" w:color="BBBBBB" w:sz="4"/>
-            </w:tcBorders>
-            <w:shd w:fill="FBE3E3" w:color="auto" w:val="clear"/>
+            <w:tcMar>
+              <w:top w:type="dxa" w:w="40"/>
+              <w:left w:type="dxa" w:w="80"/>
+              <w:bottom w:type="dxa" w:w="40"/>
+              <w:right w:type="dxa" w:w="80"/>
+            </w:tcMar>
+          </w:tcPr>
+          <w:p>
+            <w:pPr>
+              <w:jc w:val="right"/>
+            </w:pPr>
+            <w:r>
+              <w:rPr>
+                <w:rFonts w:ascii="Arial" w:eastAsia="Yu Gothic" w:hAnsi="Arial"/>
+                <w:b w:val="false"/>
+                <w:bCs w:val="false"/>
+                <w:sz w:val="16"/>
+                <w:szCs w:val="16"/>
+              </w:rPr>
+              <w:t xml:space="preserve">—</w:t>
+            </w:r>
+          </w:p>
+        </w:tc>
+        <w:tc>
+          <w:tcPr>
+            <w:tcW w:type="dxa" w:w="720"/>
+            <w:tcBorders>
+              <w:top w:val="single" w:color="BBBBBB" w:sz="4"/>
+              <w:left w:val="single" w:color="BBBBBB" w:sz="4"/>
+              <w:bottom w:val="single" w:color="BBBBBB" w:sz="4"/>
+              <w:right w:val="single" w:color="BBBBBB" w:sz="4"/>
+            </w:tcBorders>
+            <w:tcMar>
+              <w:top w:type="dxa" w:w="40"/>
+              <w:left w:type="dxa" w:w="80"/>
+              <w:bottom w:type="dxa" w:w="40"/>
+              <w:right w:type="dxa" w:w="80"/>
+            </w:tcMar>
+          </w:tcPr>
+          <w:p>
+            <w:pPr>
+              <w:jc w:val="right"/>
+            </w:pPr>
+            <w:r>
+              <w:rPr>
+                <w:rFonts w:ascii="Arial" w:eastAsia="Yu Gothic" w:hAnsi="Arial"/>
+                <w:b w:val="false"/>
+                <w:bCs w:val="false"/>
+                <w:sz w:val="16"/>
+                <w:szCs w:val="16"/>
+              </w:rPr>
+              <w:t xml:space="preserve">395</w:t>
+            </w:r>
+          </w:p>
+        </w:tc>
+        <w:tc>
+          <w:tcPr>
+            <w:tcW w:type="dxa" w:w="720"/>
+            <w:tcBorders>
+              <w:top w:val="single" w:color="BBBBBB" w:sz="4"/>
+              <w:left w:val="single" w:color="BBBBBB" w:sz="4"/>
+              <w:bottom w:val="single" w:color="BBBBBB" w:sz="4"/>
+              <w:right w:val="single" w:color="BBBBBB" w:sz="4"/>
+            </w:tcBorders>
+            <w:tcMar>
+              <w:top w:type="dxa" w:w="40"/>
+              <w:left w:type="dxa" w:w="80"/>
+              <w:bottom w:type="dxa" w:w="40"/>
+              <w:right w:type="dxa" w:w="80"/>
+            </w:tcMar>
+          </w:tcPr>
+          <w:p>
+            <w:pPr>
+              <w:jc w:val="right"/>
+            </w:pPr>
+            <w:r>
+              <w:rPr>
+                <w:rFonts w:ascii="Arial" w:eastAsia="Yu Gothic" w:hAnsi="Arial"/>
+                <w:b w:val="false"/>
+                <w:bCs w:val="false"/>
+                <w:sz w:val="16"/>
+                <w:szCs w:val="16"/>
+              </w:rPr>
+              <w:t xml:space="preserve">745</w:t>
+            </w:r>
+          </w:p>
+        </w:tc>
+        <w:tc>
+          <w:tcPr>
+            <w:tcW w:type="dxa" w:w="720"/>
+            <w:tcBorders>
+              <w:top w:val="single" w:color="BBBBBB" w:sz="4"/>
+              <w:left w:val="single" w:color="BBBBBB" w:sz="4"/>
+              <w:bottom w:val="single" w:color="BBBBBB" w:sz="4"/>
+              <w:right w:val="single" w:color="BBBBBB" w:sz="4"/>
+            </w:tcBorders>
             <w:tcMar>
               <w:top w:type="dxa" w:w="40"/>
               <w:left w:type="dxa" w:w="80"/>
@@ -8126,7 +7899,6 @@
               <w:bottom w:val="single" w:color="BBBBBB" w:sz="4"/>
               <w:right w:val="single" w:color="BBBBBB" w:sz="4"/>
             </w:tcBorders>
-            <w:shd w:fill="FBE3E3" w:color="auto" w:val="clear"/>
             <w:tcMar>
               <w:top w:type="dxa" w:w="40"/>
               <w:left w:type="dxa" w:w="80"/>
@@ -8159,40 +7931,38 @@
               <w:bottom w:val="single" w:color="BBBBBB" w:sz="4"/>
               <w:right w:val="single" w:color="BBBBBB" w:sz="4"/>
             </w:tcBorders>
-            <w:shd w:fill="FBE3E3" w:color="auto" w:val="clear"/>
-            <w:tcMar>
-              <w:top w:type="dxa" w:w="40"/>
-              <w:left w:type="dxa" w:w="80"/>
-              <w:bottom w:type="dxa" w:w="40"/>
-              <w:right w:type="dxa" w:w="80"/>
-            </w:tcMar>
-          </w:tcPr>
-          <w:p>
-            <w:pPr>
-              <w:jc w:val="right"/>
-            </w:pPr>
-            <w:r>
-              <w:rPr>
-                <w:rFonts w:ascii="Arial" w:eastAsia="Yu Gothic" w:hAnsi="Arial"/>
-                <w:b w:val="false"/>
-                <w:bCs w:val="false"/>
-                <w:sz w:val="16"/>
-                <w:szCs w:val="16"/>
-              </w:rPr>
-              <w:t xml:space="preserve">—</w:t>
-            </w:r>
-          </w:p>
-        </w:tc>
-        <w:tc>
-          <w:tcPr>
-            <w:tcW w:type="dxa" w:w="720"/>
-            <w:tcBorders>
-              <w:top w:val="single" w:color="BBBBBB" w:sz="4"/>
-              <w:left w:val="single" w:color="BBBBBB" w:sz="4"/>
-              <w:bottom w:val="single" w:color="BBBBBB" w:sz="4"/>
-              <w:right w:val="single" w:color="BBBBBB" w:sz="4"/>
-            </w:tcBorders>
-            <w:shd w:fill="FBE3E3" w:color="auto" w:val="clear"/>
+            <w:tcMar>
+              <w:top w:type="dxa" w:w="40"/>
+              <w:left w:type="dxa" w:w="80"/>
+              <w:bottom w:type="dxa" w:w="40"/>
+              <w:right w:type="dxa" w:w="80"/>
+            </w:tcMar>
+          </w:tcPr>
+          <w:p>
+            <w:pPr>
+              <w:jc w:val="right"/>
+            </w:pPr>
+            <w:r>
+              <w:rPr>
+                <w:rFonts w:ascii="Arial" w:eastAsia="Yu Gothic" w:hAnsi="Arial"/>
+                <w:b w:val="false"/>
+                <w:bCs w:val="false"/>
+                <w:sz w:val="16"/>
+                <w:szCs w:val="16"/>
+              </w:rPr>
+              <w:t xml:space="preserve">—</w:t>
+            </w:r>
+          </w:p>
+        </w:tc>
+        <w:tc>
+          <w:tcPr>
+            <w:tcW w:type="dxa" w:w="720"/>
+            <w:tcBorders>
+              <w:top w:val="single" w:color="BBBBBB" w:sz="4"/>
+              <w:left w:val="single" w:color="BBBBBB" w:sz="4"/>
+              <w:bottom w:val="single" w:color="BBBBBB" w:sz="4"/>
+              <w:right w:val="single" w:color="BBBBBB" w:sz="4"/>
+            </w:tcBorders>
             <w:tcMar>
               <w:top w:type="dxa" w:w="40"/>
               <w:left w:type="dxa" w:w="80"/>
@@ -8225,27 +7995,26 @@
               <w:bottom w:val="single" w:color="BBBBBB" w:sz="4"/>
               <w:right w:val="single" w:color="BBBBBB" w:sz="4"/>
             </w:tcBorders>
-            <w:shd w:fill="FBE3E3" w:color="auto" w:val="clear"/>
-            <w:tcMar>
-              <w:top w:type="dxa" w:w="40"/>
-              <w:left w:type="dxa" w:w="80"/>
-              <w:bottom w:type="dxa" w:w="40"/>
-              <w:right w:type="dxa" w:w="80"/>
-            </w:tcMar>
-          </w:tcPr>
-          <w:p>
-            <w:pPr>
-              <w:jc w:val="right"/>
-            </w:pPr>
-            <w:r>
-              <w:rPr>
-                <w:rFonts w:ascii="Arial" w:eastAsia="Yu Gothic" w:hAnsi="Arial"/>
-                <w:b w:val="false"/>
-                <w:bCs w:val="false"/>
-                <w:sz w:val="16"/>
-                <w:szCs w:val="16"/>
-              </w:rPr>
-              <w:t xml:space="preserve">11,400</w:t>
+            <w:tcMar>
+              <w:top w:type="dxa" w:w="40"/>
+              <w:left w:type="dxa" w:w="80"/>
+              <w:bottom w:type="dxa" w:w="40"/>
+              <w:right w:type="dxa" w:w="80"/>
+            </w:tcMar>
+          </w:tcPr>
+          <w:p>
+            <w:pPr>
+              <w:jc w:val="right"/>
+            </w:pPr>
+            <w:r>
+              <w:rPr>
+                <w:rFonts w:ascii="Arial" w:eastAsia="Yu Gothic" w:hAnsi="Arial"/>
+                <w:b w:val="false"/>
+                <w:bCs w:val="false"/>
+                <w:sz w:val="16"/>
+                <w:szCs w:val="16"/>
+              </w:rPr>
+              <w:t xml:space="preserve">12,540</w:t>
             </w:r>
           </w:p>
         </w:tc>
@@ -8258,27 +8027,26 @@
               <w:bottom w:val="single" w:color="BBBBBB" w:sz="4"/>
               <w:right w:val="single" w:color="BBBBBB" w:sz="4"/>
             </w:tcBorders>
-            <w:shd w:fill="FBE3E3" w:color="auto" w:val="clear"/>
-            <w:tcMar>
-              <w:top w:type="dxa" w:w="40"/>
-              <w:left w:type="dxa" w:w="80"/>
-              <w:bottom w:type="dxa" w:w="40"/>
-              <w:right w:type="dxa" w:w="80"/>
-            </w:tcMar>
-          </w:tcPr>
-          <w:p>
-            <w:pPr>
-              <w:jc w:val="right"/>
-            </w:pPr>
-            <w:r>
-              <w:rPr>
-                <w:rFonts w:ascii="Arial" w:eastAsia="Yu Gothic" w:hAnsi="Arial"/>
-                <w:b w:val="false"/>
-                <w:bCs w:val="false"/>
-                <w:sz w:val="16"/>
-                <w:szCs w:val="16"/>
-              </w:rPr>
-              <w:t xml:space="preserve">300</w:t>
+            <w:tcMar>
+              <w:top w:type="dxa" w:w="40"/>
+              <w:left w:type="dxa" w:w="80"/>
+              <w:bottom w:type="dxa" w:w="40"/>
+              <w:right w:type="dxa" w:w="80"/>
+            </w:tcMar>
+          </w:tcPr>
+          <w:p>
+            <w:pPr>
+              <w:jc w:val="right"/>
+            </w:pPr>
+            <w:r>
+              <w:rPr>
+                <w:rFonts w:ascii="Arial" w:eastAsia="Yu Gothic" w:hAnsi="Arial"/>
+                <w:b w:val="false"/>
+                <w:bCs w:val="false"/>
+                <w:sz w:val="16"/>
+                <w:szCs w:val="16"/>
+              </w:rPr>
+              <w:t xml:space="preserve">560</w:t>
             </w:r>
           </w:p>
         </w:tc>
@@ -8291,7 +8059,6 @@
               <w:bottom w:val="single" w:color="BBBBBB" w:sz="4"/>
               <w:right w:val="single" w:color="BBBBBB" w:sz="4"/>
             </w:tcBorders>
-            <w:shd w:fill="FBE3E3" w:color="auto" w:val="clear"/>
             <w:tcMar>
               <w:top w:type="dxa" w:w="40"/>
               <w:left w:type="dxa" w:w="80"/>
@@ -8311,7 +8078,7 @@
                 <w:sz w:val="16"/>
                 <w:szCs w:val="16"/>
               </w:rPr>
-              <w:t xml:space="preserve">Ghana 0 300</w:t>
+              <w:t xml:space="preserve">Ribáuè 2026 206 / Ribáuè 2025 354</w:t>
             </w:r>
           </w:p>
         </w:tc>
@@ -8409,71 +8176,71 @@
                 <w:sz w:val="16"/>
                 <w:szCs w:val="16"/>
               </w:rPr>
-              <w:t xml:space="preserve">—</w:t>
-            </w:r>
-          </w:p>
-        </w:tc>
-        <w:tc>
-          <w:tcPr>
-            <w:tcW w:type="dxa" w:w="720"/>
-            <w:tcBorders>
-              <w:top w:val="single" w:color="BBBBBB" w:sz="4"/>
-              <w:left w:val="single" w:color="BBBBBB" w:sz="4"/>
-              <w:bottom w:val="single" w:color="BBBBBB" w:sz="4"/>
-              <w:right w:val="single" w:color="BBBBBB" w:sz="4"/>
-            </w:tcBorders>
-            <w:tcMar>
-              <w:top w:type="dxa" w:w="40"/>
-              <w:left w:type="dxa" w:w="80"/>
-              <w:bottom w:type="dxa" w:w="40"/>
-              <w:right w:type="dxa" w:w="80"/>
-            </w:tcMar>
-          </w:tcPr>
-          <w:p>
-            <w:pPr>
-              <w:jc w:val="right"/>
-            </w:pPr>
-            <w:r>
-              <w:rPr>
-                <w:rFonts w:ascii="Arial" w:eastAsia="Yu Gothic" w:hAnsi="Arial"/>
-                <w:b w:val="false"/>
-                <w:bCs w:val="false"/>
-                <w:sz w:val="16"/>
-                <w:szCs w:val="16"/>
-              </w:rPr>
-              <w:t xml:space="preserve">—</w:t>
-            </w:r>
-          </w:p>
-        </w:tc>
-        <w:tc>
-          <w:tcPr>
-            <w:tcW w:type="dxa" w:w="720"/>
-            <w:tcBorders>
-              <w:top w:val="single" w:color="BBBBBB" w:sz="4"/>
-              <w:left w:val="single" w:color="BBBBBB" w:sz="4"/>
-              <w:bottom w:val="single" w:color="BBBBBB" w:sz="4"/>
-              <w:right w:val="single" w:color="BBBBBB" w:sz="4"/>
-            </w:tcBorders>
-            <w:tcMar>
-              <w:top w:type="dxa" w:w="40"/>
-              <w:left w:type="dxa" w:w="80"/>
-              <w:bottom w:type="dxa" w:w="40"/>
-              <w:right w:type="dxa" w:w="80"/>
-            </w:tcMar>
-          </w:tcPr>
-          <w:p>
-            <w:pPr>
-              <w:jc w:val="right"/>
-            </w:pPr>
-            <w:r>
-              <w:rPr>
-                <w:rFonts w:ascii="Arial" w:eastAsia="Yu Gothic" w:hAnsi="Arial"/>
-                <w:b w:val="false"/>
-                <w:bCs w:val="false"/>
-                <w:sz w:val="16"/>
-                <w:szCs w:val="16"/>
-              </w:rPr>
-              <w:t xml:space="preserve">8,120</w:t>
+              <w:t xml:space="preserve">115</w:t>
+            </w:r>
+          </w:p>
+        </w:tc>
+        <w:tc>
+          <w:tcPr>
+            <w:tcW w:type="dxa" w:w="720"/>
+            <w:tcBorders>
+              <w:top w:val="single" w:color="BBBBBB" w:sz="4"/>
+              <w:left w:val="single" w:color="BBBBBB" w:sz="4"/>
+              <w:bottom w:val="single" w:color="BBBBBB" w:sz="4"/>
+              <w:right w:val="single" w:color="BBBBBB" w:sz="4"/>
+            </w:tcBorders>
+            <w:tcMar>
+              <w:top w:type="dxa" w:w="40"/>
+              <w:left w:type="dxa" w:w="80"/>
+              <w:bottom w:type="dxa" w:w="40"/>
+              <w:right w:type="dxa" w:w="80"/>
+            </w:tcMar>
+          </w:tcPr>
+          <w:p>
+            <w:pPr>
+              <w:jc w:val="right"/>
+            </w:pPr>
+            <w:r>
+              <w:rPr>
+                <w:rFonts w:ascii="Arial" w:eastAsia="Yu Gothic" w:hAnsi="Arial"/>
+                <w:b w:val="false"/>
+                <w:bCs w:val="false"/>
+                <w:sz w:val="16"/>
+                <w:szCs w:val="16"/>
+              </w:rPr>
+              <w:t xml:space="preserve">745</w:t>
+            </w:r>
+          </w:p>
+        </w:tc>
+        <w:tc>
+          <w:tcPr>
+            <w:tcW w:type="dxa" w:w="720"/>
+            <w:tcBorders>
+              <w:top w:val="single" w:color="BBBBBB" w:sz="4"/>
+              <w:left w:val="single" w:color="BBBBBB" w:sz="4"/>
+              <w:bottom w:val="single" w:color="BBBBBB" w:sz="4"/>
+              <w:right w:val="single" w:color="BBBBBB" w:sz="4"/>
+            </w:tcBorders>
+            <w:tcMar>
+              <w:top w:type="dxa" w:w="40"/>
+              <w:left w:type="dxa" w:w="80"/>
+              <w:bottom w:type="dxa" w:w="40"/>
+              <w:right w:type="dxa" w:w="80"/>
+            </w:tcMar>
+          </w:tcPr>
+          <w:p>
+            <w:pPr>
+              <w:jc w:val="right"/>
+            </w:pPr>
+            <w:r>
+              <w:rPr>
+                <w:rFonts w:ascii="Arial" w:eastAsia="Yu Gothic" w:hAnsi="Arial"/>
+                <w:b w:val="false"/>
+                <w:bCs w:val="false"/>
+                <w:sz w:val="16"/>
+                <w:szCs w:val="16"/>
+              </w:rPr>
+              <w:t xml:space="preserve">8,400</w:t>
             </w:r>
           </w:p>
         </w:tc>
@@ -8601,7 +8368,7 @@
                 <w:sz w:val="16"/>
                 <w:szCs w:val="16"/>
               </w:rPr>
-              <w:t xml:space="preserve">11,120</w:t>
+              <w:t xml:space="preserve">12,260</w:t>
             </w:r>
           </w:p>
         </w:tc>
@@ -8665,7 +8432,7 @@
                 <w:sz w:val="16"/>
                 <w:szCs w:val="16"/>
               </w:rPr>
-              <w:t xml:space="preserve">India 280</w:t>
+              <w:t xml:space="preserve">Ribáuè 2025 280</w:t>
             </w:r>
           </w:p>
         </w:tc>
@@ -8766,7 +8533,7 @@
                 <w:sz w:val="16"/>
                 <w:szCs w:val="16"/>
               </w:rPr>
-              <w:t xml:space="preserve">—</w:t>
+              <w:t xml:space="preserve">115</w:t>
             </w:r>
           </w:p>
         </w:tc>
@@ -8799,7 +8566,7 @@
                 <w:sz w:val="16"/>
                 <w:szCs w:val="16"/>
               </w:rPr>
-              <w:t xml:space="preserve">—</w:t>
+              <w:t xml:space="preserve">745</w:t>
             </w:r>
           </w:p>
         </w:tc>
@@ -8832,7 +8599,7 @@
                 <w:sz w:val="16"/>
                 <w:szCs w:val="16"/>
               </w:rPr>
-              <w:t xml:space="preserve">8,120</w:t>
+              <w:t xml:space="preserve">8,400</w:t>
             </w:r>
           </w:p>
         </w:tc>
@@ -8964,7 +8731,7 @@
                 <w:sz w:val="16"/>
                 <w:szCs w:val="16"/>
               </w:rPr>
-              <w:t xml:space="preserve">11,120</w:t>
+              <w:t xml:space="preserve">12,260</w:t>
             </w:r>
           </w:p>
         </w:tc>
@@ -9160,39 +8927,39 @@
                 <w:sz w:val="16"/>
                 <w:szCs w:val="16"/>
               </w:rPr>
-              <w:t xml:space="preserve">—</w:t>
-            </w:r>
-          </w:p>
-        </w:tc>
-        <w:tc>
-          <w:tcPr>
-            <w:tcW w:type="dxa" w:w="720"/>
-            <w:tcBorders>
-              <w:top w:val="single" w:color="BBBBBB" w:sz="4"/>
-              <w:left w:val="single" w:color="BBBBBB" w:sz="4"/>
-              <w:bottom w:val="single" w:color="BBBBBB" w:sz="4"/>
-              <w:right w:val="single" w:color="BBBBBB" w:sz="4"/>
-            </w:tcBorders>
-            <w:tcMar>
-              <w:top w:type="dxa" w:w="40"/>
-              <w:left w:type="dxa" w:w="80"/>
-              <w:bottom w:type="dxa" w:w="40"/>
-              <w:right w:type="dxa" w:w="80"/>
-            </w:tcMar>
-          </w:tcPr>
-          <w:p>
-            <w:pPr>
-              <w:jc w:val="right"/>
-            </w:pPr>
-            <w:r>
-              <w:rPr>
-                <w:rFonts w:ascii="Arial" w:eastAsia="Yu Gothic" w:hAnsi="Arial"/>
-                <w:b w:val="false"/>
-                <w:bCs w:val="false"/>
-                <w:sz w:val="16"/>
-                <w:szCs w:val="16"/>
-              </w:rPr>
-              <w:t xml:space="preserve">7,560</w:t>
+              <w:t xml:space="preserve">300</w:t>
+            </w:r>
+          </w:p>
+        </w:tc>
+        <w:tc>
+          <w:tcPr>
+            <w:tcW w:type="dxa" w:w="720"/>
+            <w:tcBorders>
+              <w:top w:val="single" w:color="BBBBBB" w:sz="4"/>
+              <w:left w:val="single" w:color="BBBBBB" w:sz="4"/>
+              <w:bottom w:val="single" w:color="BBBBBB" w:sz="4"/>
+              <w:right w:val="single" w:color="BBBBBB" w:sz="4"/>
+            </w:tcBorders>
+            <w:tcMar>
+              <w:top w:type="dxa" w:w="40"/>
+              <w:left w:type="dxa" w:w="80"/>
+              <w:bottom w:type="dxa" w:w="40"/>
+              <w:right w:type="dxa" w:w="80"/>
+            </w:tcMar>
+          </w:tcPr>
+          <w:p>
+            <w:pPr>
+              <w:jc w:val="right"/>
+            </w:pPr>
+            <w:r>
+              <w:rPr>
+                <w:rFonts w:ascii="Arial" w:eastAsia="Yu Gothic" w:hAnsi="Arial"/>
+                <w:b w:val="false"/>
+                <w:bCs w:val="false"/>
+                <w:sz w:val="16"/>
+                <w:szCs w:val="16"/>
+              </w:rPr>
+              <w:t xml:space="preserve">8,400</w:t>
             </w:r>
           </w:p>
         </w:tc>
@@ -9320,7 +9087,7 @@
                 <w:sz w:val="16"/>
                 <w:szCs w:val="16"/>
               </w:rPr>
-              <w:t xml:space="preserve">10,560</w:t>
+              <w:t xml:space="preserve">11,700</w:t>
             </w:r>
           </w:p>
         </w:tc>
@@ -9384,7 +9151,7 @@
                 <w:sz w:val="16"/>
                 <w:szCs w:val="16"/>
               </w:rPr>
-              <w:t xml:space="preserve">India 560</w:t>
+              <w:t xml:space="preserve">Ribáuè 2025 115 / Ghana 0 445</w:t>
             </w:r>
           </w:p>
         </w:tc>
@@ -9546,7 +9313,7 @@
                 <w:sz w:val="16"/>
                 <w:szCs w:val="16"/>
               </w:rPr>
-              <w:t xml:space="preserve">7,000</w:t>
+              <w:t xml:space="preserve">8,140</w:t>
             </w:r>
           </w:p>
         </w:tc>
@@ -9674,7 +9441,7 @@
                 <w:sz w:val="16"/>
                 <w:szCs w:val="16"/>
               </w:rPr>
-              <w:t xml:space="preserve">10,000</w:t>
+              <w:t xml:space="preserve">11,140</w:t>
             </w:r>
           </w:p>
         </w:tc>
@@ -9738,7 +9505,7 @@
                 <w:sz w:val="16"/>
                 <w:szCs w:val="16"/>
               </w:rPr>
-              <w:t xml:space="preserve">India 560</w:t>
+              <w:t xml:space="preserve">Ghana 0 300 / India 260</w:t>
             </w:r>
           </w:p>
         </w:tc>
@@ -9900,7 +9667,7 @@
                 <w:sz w:val="16"/>
                 <w:szCs w:val="16"/>
               </w:rPr>
-              <w:t xml:space="preserve">6,440</w:t>
+              <w:t xml:space="preserve">7,580</w:t>
             </w:r>
           </w:p>
         </w:tc>
@@ -10028,7 +9795,7 @@
                 <w:sz w:val="16"/>
                 <w:szCs w:val="16"/>
               </w:rPr>
-              <w:t xml:space="preserve">9,440</w:t>
+              <w:t xml:space="preserve">10,580</w:t>
             </w:r>
           </w:p>
         </w:tc>
@@ -10254,7 +10021,7 @@
                 <w:sz w:val="16"/>
                 <w:szCs w:val="16"/>
               </w:rPr>
-              <w:t xml:space="preserve">5,880</w:t>
+              <w:t xml:space="preserve">7,020</w:t>
             </w:r>
           </w:p>
         </w:tc>
@@ -10382,7 +10149,7 @@
                 <w:sz w:val="16"/>
                 <w:szCs w:val="16"/>
               </w:rPr>
-              <w:t xml:space="preserve">8,880</w:t>
+              <w:t xml:space="preserve">10,020</w:t>
             </w:r>
           </w:p>
         </w:tc>
@@ -10608,7 +10375,7 @@
                 <w:sz w:val="16"/>
                 <w:szCs w:val="16"/>
               </w:rPr>
-              <w:t xml:space="preserve">5,320</w:t>
+              <w:t xml:space="preserve">6,460</w:t>
             </w:r>
           </w:p>
         </w:tc>
@@ -10736,7 +10503,7 @@
                 <w:sz w:val="16"/>
                 <w:szCs w:val="16"/>
               </w:rPr>
-              <w:t xml:space="preserve">8,320</w:t>
+              <w:t xml:space="preserve">9,460</w:t>
             </w:r>
           </w:p>
         </w:tc>
@@ -10962,7 +10729,7 @@
                 <w:sz w:val="16"/>
                 <w:szCs w:val="16"/>
               </w:rPr>
-              <w:t xml:space="preserve">5,040</w:t>
+              <w:t xml:space="preserve">6,180</w:t>
             </w:r>
           </w:p>
         </w:tc>
@@ -11090,7 +10857,7 @@
                 <w:sz w:val="16"/>
                 <w:szCs w:val="16"/>
               </w:rPr>
-              <w:t xml:space="preserve">8,040</w:t>
+              <w:t xml:space="preserve">9,180</w:t>
             </w:r>
           </w:p>
         </w:tc>
@@ -11321,7 +11088,7 @@
                 <w:sz w:val="16"/>
                 <w:szCs w:val="16"/>
               </w:rPr>
-              <w:t xml:space="preserve">5,040</w:t>
+              <w:t xml:space="preserve">6,180</w:t>
             </w:r>
           </w:p>
         </w:tc>
@@ -11453,7 +11220,7 @@
                 <w:sz w:val="16"/>
                 <w:szCs w:val="16"/>
               </w:rPr>
-              <w:t xml:space="preserve">8,040</w:t>
+              <w:t xml:space="preserve">9,180</w:t>
             </w:r>
           </w:p>
         </w:tc>
@@ -11681,7 +11448,7 @@
                 <w:sz w:val="16"/>
                 <w:szCs w:val="16"/>
               </w:rPr>
-              <w:t xml:space="preserve">4,480</w:t>
+              <w:t xml:space="preserve">5,620</w:t>
             </w:r>
           </w:p>
         </w:tc>
@@ -11809,7 +11576,7 @@
                 <w:sz w:val="16"/>
                 <w:szCs w:val="16"/>
               </w:rPr>
-              <w:t xml:space="preserve">7,480</w:t>
+              <w:t xml:space="preserve">8,620</w:t>
             </w:r>
           </w:p>
         </w:tc>
@@ -12035,7 +11802,7 @@
                 <w:sz w:val="16"/>
                 <w:szCs w:val="16"/>
               </w:rPr>
-              <w:t xml:space="preserve">3,920</w:t>
+              <w:t xml:space="preserve">5,060</w:t>
             </w:r>
           </w:p>
         </w:tc>
@@ -12163,7 +11930,7 @@
                 <w:sz w:val="16"/>
                 <w:szCs w:val="16"/>
               </w:rPr>
-              <w:t xml:space="preserve">6,920</w:t>
+              <w:t xml:space="preserve">8,060</w:t>
             </w:r>
           </w:p>
         </w:tc>
@@ -12389,7 +12156,7 @@
                 <w:sz w:val="16"/>
                 <w:szCs w:val="16"/>
               </w:rPr>
-              <w:t xml:space="preserve">3,360</w:t>
+              <w:t xml:space="preserve">4,500</w:t>
             </w:r>
           </w:p>
         </w:tc>
@@ -12517,7 +12284,7 @@
                 <w:sz w:val="16"/>
                 <w:szCs w:val="16"/>
               </w:rPr>
-              <w:t xml:space="preserve">6,360</w:t>
+              <w:t xml:space="preserve">7,500</w:t>
             </w:r>
           </w:p>
         </w:tc>
@@ -12743,7 +12510,7 @@
                 <w:sz w:val="16"/>
                 <w:szCs w:val="16"/>
               </w:rPr>
-              <w:t xml:space="preserve">2,800</w:t>
+              <w:t xml:space="preserve">3,940</w:t>
             </w:r>
           </w:p>
         </w:tc>
@@ -12871,7 +12638,7 @@
                 <w:sz w:val="16"/>
                 <w:szCs w:val="16"/>
               </w:rPr>
-              <w:t xml:space="preserve">5,800</w:t>
+              <w:t xml:space="preserve">6,940</w:t>
             </w:r>
           </w:p>
         </w:tc>
@@ -13097,7 +12864,7 @@
                 <w:sz w:val="16"/>
                 <w:szCs w:val="16"/>
               </w:rPr>
-              <w:t xml:space="preserve">2,240</w:t>
+              <w:t xml:space="preserve">3,380</w:t>
             </w:r>
           </w:p>
         </w:tc>
@@ -13225,7 +12992,7 @@
                 <w:sz w:val="16"/>
                 <w:szCs w:val="16"/>
               </w:rPr>
-              <w:t xml:space="preserve">5,240</w:t>
+              <w:t xml:space="preserve">6,380</w:t>
             </w:r>
           </w:p>
         </w:tc>
@@ -13451,7 +13218,7 @@
                 <w:sz w:val="16"/>
                 <w:szCs w:val="16"/>
               </w:rPr>
-              <w:t xml:space="preserve">1,960</w:t>
+              <w:t xml:space="preserve">3,100</w:t>
             </w:r>
           </w:p>
         </w:tc>
@@ -13579,7 +13346,7 @@
                 <w:sz w:val="16"/>
                 <w:szCs w:val="16"/>
               </w:rPr>
-              <w:t xml:space="preserve">4,960</w:t>
+              <w:t xml:space="preserve">6,100</w:t>
             </w:r>
           </w:p>
         </w:tc>
@@ -13810,7 +13577,7 @@
                 <w:sz w:val="16"/>
                 <w:szCs w:val="16"/>
               </w:rPr>
-              <w:t xml:space="preserve">1,960</w:t>
+              <w:t xml:space="preserve">3,100</w:t>
             </w:r>
           </w:p>
         </w:tc>
@@ -13942,7 +13709,7 @@
                 <w:sz w:val="16"/>
                 <w:szCs w:val="16"/>
               </w:rPr>
-              <w:t xml:space="preserve">4,960</w:t>
+              <w:t xml:space="preserve">6,100</w:t>
             </w:r>
           </w:p>
         </w:tc>
@@ -14170,7 +13937,7 @@
                 <w:sz w:val="16"/>
                 <w:szCs w:val="16"/>
               </w:rPr>
-              <w:t xml:space="preserve">1,400</w:t>
+              <w:t xml:space="preserve">2,540</w:t>
             </w:r>
           </w:p>
         </w:tc>
@@ -14298,7 +14065,7 @@
                 <w:sz w:val="16"/>
                 <w:szCs w:val="16"/>
               </w:rPr>
-              <w:t xml:space="preserve">4,400</w:t>
+              <w:t xml:space="preserve">5,540</w:t>
             </w:r>
           </w:p>
         </w:tc>
@@ -14524,7 +14291,7 @@
                 <w:sz w:val="16"/>
                 <w:szCs w:val="16"/>
               </w:rPr>
-              <w:t xml:space="preserve">840</w:t>
+              <w:t xml:space="preserve">1,980</w:t>
             </w:r>
           </w:p>
         </w:tc>
@@ -14652,7 +14419,7 @@
                 <w:sz w:val="16"/>
                 <w:szCs w:val="16"/>
               </w:rPr>
-              <w:t xml:space="preserve">3,840</w:t>
+              <w:t xml:space="preserve">4,980</w:t>
             </w:r>
           </w:p>
         </w:tc>
@@ -14878,7 +14645,7 @@
                 <w:sz w:val="16"/>
                 <w:szCs w:val="16"/>
               </w:rPr>
-              <w:t xml:space="preserve">280</w:t>
+              <w:t xml:space="preserve">1,420</w:t>
             </w:r>
           </w:p>
         </w:tc>
@@ -15006,7 +14773,7 @@
                 <w:sz w:val="16"/>
                 <w:szCs w:val="16"/>
               </w:rPr>
-              <w:t xml:space="preserve">3,280</w:t>
+              <w:t xml:space="preserve">4,420</w:t>
             </w:r>
           </w:p>
         </w:tc>
@@ -15232,39 +14999,39 @@
                 <w:sz w:val="16"/>
                 <w:szCs w:val="16"/>
               </w:rPr>
-              <w:t xml:space="preserve">—</w:t>
-            </w:r>
-          </w:p>
-        </w:tc>
-        <w:tc>
-          <w:tcPr>
-            <w:tcW w:type="dxa" w:w="720"/>
-            <w:tcBorders>
-              <w:top w:val="single" w:color="BBBBBB" w:sz="4"/>
-              <w:left w:val="single" w:color="BBBBBB" w:sz="4"/>
-              <w:bottom w:val="single" w:color="BBBBBB" w:sz="4"/>
-              <w:right w:val="single" w:color="BBBBBB" w:sz="4"/>
-            </w:tcBorders>
-            <w:tcMar>
-              <w:top w:type="dxa" w:w="40"/>
-              <w:left w:type="dxa" w:w="80"/>
-              <w:bottom w:type="dxa" w:w="40"/>
-              <w:right w:type="dxa" w:w="80"/>
-            </w:tcMar>
-          </w:tcPr>
-          <w:p>
-            <w:pPr>
-              <w:jc w:val="right"/>
-            </w:pPr>
-            <w:r>
-              <w:rPr>
-                <w:rFonts w:ascii="Arial" w:eastAsia="Yu Gothic" w:hAnsi="Arial"/>
-                <w:b w:val="false"/>
-                <w:bCs w:val="false"/>
-                <w:sz w:val="16"/>
-                <w:szCs w:val="16"/>
-              </w:rPr>
-              <w:t xml:space="preserve">2,720</w:t>
+              <w:t xml:space="preserve">860</w:t>
+            </w:r>
+          </w:p>
+        </w:tc>
+        <w:tc>
+          <w:tcPr>
+            <w:tcW w:type="dxa" w:w="720"/>
+            <w:tcBorders>
+              <w:top w:val="single" w:color="BBBBBB" w:sz="4"/>
+              <w:left w:val="single" w:color="BBBBBB" w:sz="4"/>
+              <w:bottom w:val="single" w:color="BBBBBB" w:sz="4"/>
+              <w:right w:val="single" w:color="BBBBBB" w:sz="4"/>
+            </w:tcBorders>
+            <w:tcMar>
+              <w:top w:type="dxa" w:w="40"/>
+              <w:left w:type="dxa" w:w="80"/>
+              <w:bottom w:type="dxa" w:w="40"/>
+              <w:right w:type="dxa" w:w="80"/>
+            </w:tcMar>
+          </w:tcPr>
+          <w:p>
+            <w:pPr>
+              <w:jc w:val="right"/>
+            </w:pPr>
+            <w:r>
+              <w:rPr>
+                <w:rFonts w:ascii="Arial" w:eastAsia="Yu Gothic" w:hAnsi="Arial"/>
+                <w:b w:val="false"/>
+                <w:bCs w:val="false"/>
+                <w:sz w:val="16"/>
+                <w:szCs w:val="16"/>
+              </w:rPr>
+              <w:t xml:space="preserve">3,000</w:t>
             </w:r>
           </w:p>
         </w:tc>
@@ -15360,7 +15127,7 @@
                 <w:sz w:val="16"/>
                 <w:szCs w:val="16"/>
               </w:rPr>
-              <w:t xml:space="preserve">2,720</w:t>
+              <w:t xml:space="preserve">3,860</w:t>
             </w:r>
           </w:p>
         </w:tc>
@@ -15424,7 +15191,7 @@
                 <w:sz w:val="16"/>
                 <w:szCs w:val="16"/>
               </w:rPr>
-              <w:t xml:space="preserve">India 280 / Ghana 1 280</w:t>
+              <w:t xml:space="preserve">India 560</w:t>
             </w:r>
           </w:p>
         </w:tc>
@@ -15586,39 +15353,39 @@
                 <w:sz w:val="16"/>
                 <w:szCs w:val="16"/>
               </w:rPr>
-              <w:t xml:space="preserve">—</w:t>
-            </w:r>
-          </w:p>
-        </w:tc>
-        <w:tc>
-          <w:tcPr>
-            <w:tcW w:type="dxa" w:w="720"/>
-            <w:tcBorders>
-              <w:top w:val="single" w:color="BBBBBB" w:sz="4"/>
-              <w:left w:val="single" w:color="BBBBBB" w:sz="4"/>
-              <w:bottom w:val="single" w:color="BBBBBB" w:sz="4"/>
-              <w:right w:val="single" w:color="BBBBBB" w:sz="4"/>
-            </w:tcBorders>
-            <w:tcMar>
-              <w:top w:type="dxa" w:w="40"/>
-              <w:left w:type="dxa" w:w="80"/>
-              <w:bottom w:type="dxa" w:w="40"/>
-              <w:right w:type="dxa" w:w="80"/>
-            </w:tcMar>
-          </w:tcPr>
-          <w:p>
-            <w:pPr>
-              <w:jc w:val="right"/>
-            </w:pPr>
-            <w:r>
-              <w:rPr>
-                <w:rFonts w:ascii="Arial" w:eastAsia="Yu Gothic" w:hAnsi="Arial"/>
-                <w:b w:val="false"/>
-                <w:bCs w:val="false"/>
-                <w:sz w:val="16"/>
-                <w:szCs w:val="16"/>
-              </w:rPr>
-              <w:t xml:space="preserve">2,160</w:t>
+              <w:t xml:space="preserve">300</w:t>
+            </w:r>
+          </w:p>
+        </w:tc>
+        <w:tc>
+          <w:tcPr>
+            <w:tcW w:type="dxa" w:w="720"/>
+            <w:tcBorders>
+              <w:top w:val="single" w:color="BBBBBB" w:sz="4"/>
+              <w:left w:val="single" w:color="BBBBBB" w:sz="4"/>
+              <w:bottom w:val="single" w:color="BBBBBB" w:sz="4"/>
+              <w:right w:val="single" w:color="BBBBBB" w:sz="4"/>
+            </w:tcBorders>
+            <w:tcMar>
+              <w:top w:type="dxa" w:w="40"/>
+              <w:left w:type="dxa" w:w="80"/>
+              <w:bottom w:type="dxa" w:w="40"/>
+              <w:right w:type="dxa" w:w="80"/>
+            </w:tcMar>
+          </w:tcPr>
+          <w:p>
+            <w:pPr>
+              <w:jc w:val="right"/>
+            </w:pPr>
+            <w:r>
+              <w:rPr>
+                <w:rFonts w:ascii="Arial" w:eastAsia="Yu Gothic" w:hAnsi="Arial"/>
+                <w:b w:val="false"/>
+                <w:bCs w:val="false"/>
+                <w:sz w:val="16"/>
+                <w:szCs w:val="16"/>
+              </w:rPr>
+              <w:t xml:space="preserve">3,000</w:t>
             </w:r>
           </w:p>
         </w:tc>
@@ -15714,7 +15481,7 @@
                 <w:sz w:val="16"/>
                 <w:szCs w:val="16"/>
               </w:rPr>
-              <w:t xml:space="preserve">5,860</w:t>
+              <w:t xml:space="preserve">7,000</w:t>
             </w:r>
           </w:p>
         </w:tc>
@@ -15778,7 +15545,7 @@
                 <w:sz w:val="16"/>
                 <w:szCs w:val="16"/>
               </w:rPr>
-              <w:t xml:space="preserve">Ghana 1 560</w:t>
+              <w:t xml:space="preserve">India 560</w:t>
             </w:r>
           </w:p>
         </w:tc>
@@ -15940,39 +15707,39 @@
                 <w:sz w:val="16"/>
                 <w:szCs w:val="16"/>
               </w:rPr>
-              <w:t xml:space="preserve">—</w:t>
-            </w:r>
-          </w:p>
-        </w:tc>
-        <w:tc>
-          <w:tcPr>
-            <w:tcW w:type="dxa" w:w="720"/>
-            <w:tcBorders>
-              <w:top w:val="single" w:color="BBBBBB" w:sz="4"/>
-              <w:left w:val="single" w:color="BBBBBB" w:sz="4"/>
-              <w:bottom w:val="single" w:color="BBBBBB" w:sz="4"/>
-              <w:right w:val="single" w:color="BBBBBB" w:sz="4"/>
-            </w:tcBorders>
-            <w:tcMar>
-              <w:top w:type="dxa" w:w="40"/>
-              <w:left w:type="dxa" w:w="80"/>
-              <w:bottom w:type="dxa" w:w="40"/>
-              <w:right w:type="dxa" w:w="80"/>
-            </w:tcMar>
-          </w:tcPr>
-          <w:p>
-            <w:pPr>
-              <w:jc w:val="right"/>
-            </w:pPr>
-            <w:r>
-              <w:rPr>
-                <w:rFonts w:ascii="Arial" w:eastAsia="Yu Gothic" w:hAnsi="Arial"/>
-                <w:b w:val="false"/>
-                <w:bCs w:val="false"/>
-                <w:sz w:val="16"/>
-                <w:szCs w:val="16"/>
-              </w:rPr>
-              <w:t xml:space="preserve">1,880</w:t>
+              <w:t xml:space="preserve">20</w:t>
+            </w:r>
+          </w:p>
+        </w:tc>
+        <w:tc>
+          <w:tcPr>
+            <w:tcW w:type="dxa" w:w="720"/>
+            <w:tcBorders>
+              <w:top w:val="single" w:color="BBBBBB" w:sz="4"/>
+              <w:left w:val="single" w:color="BBBBBB" w:sz="4"/>
+              <w:bottom w:val="single" w:color="BBBBBB" w:sz="4"/>
+              <w:right w:val="single" w:color="BBBBBB" w:sz="4"/>
+            </w:tcBorders>
+            <w:tcMar>
+              <w:top w:type="dxa" w:w="40"/>
+              <w:left w:type="dxa" w:w="80"/>
+              <w:bottom w:type="dxa" w:w="40"/>
+              <w:right w:type="dxa" w:w="80"/>
+            </w:tcMar>
+          </w:tcPr>
+          <w:p>
+            <w:pPr>
+              <w:jc w:val="right"/>
+            </w:pPr>
+            <w:r>
+              <w:rPr>
+                <w:rFonts w:ascii="Arial" w:eastAsia="Yu Gothic" w:hAnsi="Arial"/>
+                <w:b w:val="false"/>
+                <w:bCs w:val="false"/>
+                <w:sz w:val="16"/>
+                <w:szCs w:val="16"/>
+              </w:rPr>
+              <w:t xml:space="preserve">3,000</w:t>
             </w:r>
           </w:p>
         </w:tc>
@@ -16068,7 +15835,7 @@
                 <w:sz w:val="16"/>
                 <w:szCs w:val="16"/>
               </w:rPr>
-              <w:t xml:space="preserve">17,580</w:t>
+              <w:t xml:space="preserve">18,720</w:t>
             </w:r>
           </w:p>
         </w:tc>
@@ -16132,7 +15899,7 @@
                 <w:sz w:val="16"/>
                 <w:szCs w:val="16"/>
               </w:rPr>
-              <w:t xml:space="preserve">Ghana 1 280</w:t>
+              <w:t xml:space="preserve">India 280</w:t>
             </w:r>
           </w:p>
         </w:tc>
@@ -16299,7 +16066,7 @@
                 <w:sz w:val="16"/>
                 <w:szCs w:val="16"/>
               </w:rPr>
-              <w:t xml:space="preserve">—</w:t>
+              <w:t xml:space="preserve">20</w:t>
             </w:r>
           </w:p>
         </w:tc>
@@ -16332,7 +16099,7 @@
                 <w:sz w:val="16"/>
                 <w:szCs w:val="16"/>
               </w:rPr>
-              <w:t xml:space="preserve">1,880</w:t>
+              <w:t xml:space="preserve">3,000</w:t>
             </w:r>
           </w:p>
         </w:tc>
@@ -16431,7 +16198,7 @@
                 <w:sz w:val="16"/>
                 <w:szCs w:val="16"/>
               </w:rPr>
-              <w:t xml:space="preserve">17,580</w:t>
+              <w:t xml:space="preserve">18,720</w:t>
             </w:r>
           </w:p>
         </w:tc>
@@ -16691,7 +16458,7 @@
                 <w:sz w:val="16"/>
                 <w:szCs w:val="16"/>
               </w:rPr>
-              <w:t xml:space="preserve">1,320</w:t>
+              <w:t xml:space="preserve">2,460</w:t>
             </w:r>
           </w:p>
         </w:tc>
@@ -16787,7 +16554,7 @@
                 <w:sz w:val="16"/>
                 <w:szCs w:val="16"/>
               </w:rPr>
-              <w:t xml:space="preserve">17,020</w:t>
+              <w:t xml:space="preserve">18,160</w:t>
             </w:r>
           </w:p>
         </w:tc>
@@ -16851,7 +16618,7 @@
                 <w:sz w:val="16"/>
                 <w:szCs w:val="16"/>
               </w:rPr>
-              <w:t xml:space="preserve">Ghana 1 560</w:t>
+              <w:t xml:space="preserve">India 20 / Ghana 1 540</w:t>
             </w:r>
           </w:p>
         </w:tc>
@@ -17045,7 +16812,7 @@
                 <w:sz w:val="16"/>
                 <w:szCs w:val="16"/>
               </w:rPr>
-              <w:t xml:space="preserve">760</w:t>
+              <w:t xml:space="preserve">1,900</w:t>
             </w:r>
           </w:p>
         </w:tc>
@@ -17141,7 +16908,7 @@
                 <w:sz w:val="16"/>
                 <w:szCs w:val="16"/>
               </w:rPr>
-              <w:t xml:space="preserve">16,460</w:t>
+              <w:t xml:space="preserve">17,600</w:t>
             </w:r>
           </w:p>
         </w:tc>
@@ -17399,7 +17166,7 @@
                 <w:sz w:val="16"/>
                 <w:szCs w:val="16"/>
               </w:rPr>
-              <w:t xml:space="preserve">200</w:t>
+              <w:t xml:space="preserve">1,340</w:t>
             </w:r>
           </w:p>
         </w:tc>
@@ -17495,7 +17262,7 @@
                 <w:sz w:val="16"/>
                 <w:szCs w:val="16"/>
               </w:rPr>
-              <w:t xml:space="preserve">15,900</w:t>
+              <w:t xml:space="preserve">17,040</w:t>
             </w:r>
           </w:p>
         </w:tc>
@@ -17574,7 +17341,6 @@
               <w:bottom w:val="single" w:color="BBBBBB" w:sz="4"/>
               <w:right w:val="single" w:color="BBBBBB" w:sz="4"/>
             </w:tcBorders>
-            <w:shd w:fill="FBE3E3" w:color="auto" w:val="clear"/>
             <w:tcMar>
               <w:top w:type="dxa" w:w="40"/>
               <w:left w:type="dxa" w:w="80"/>
@@ -17607,172 +17373,166 @@
               <w:bottom w:val="single" w:color="BBBBBB" w:sz="4"/>
               <w:right w:val="single" w:color="BBBBBB" w:sz="4"/>
             </w:tcBorders>
-            <w:shd w:fill="FBE3E3" w:color="auto" w:val="clear"/>
-            <w:tcMar>
-              <w:top w:type="dxa" w:w="40"/>
-              <w:left w:type="dxa" w:w="80"/>
-              <w:bottom w:type="dxa" w:w="40"/>
-              <w:right w:type="dxa" w:w="80"/>
-            </w:tcMar>
-          </w:tcPr>
-          <w:p>
-            <w:pPr>
-              <w:jc w:val="right"/>
-            </w:pPr>
-            <w:r>
-              <w:rPr>
-                <w:rFonts w:ascii="Arial" w:eastAsia="Yu Gothic" w:hAnsi="Arial"/>
-                <w:b w:val="false"/>
-                <w:bCs w:val="false"/>
-                <w:sz w:val="16"/>
-                <w:szCs w:val="16"/>
-              </w:rPr>
-              <w:t xml:space="preserve">—</w:t>
-            </w:r>
-          </w:p>
-        </w:tc>
-        <w:tc>
-          <w:tcPr>
-            <w:tcW w:type="dxa" w:w="720"/>
-            <w:tcBorders>
-              <w:top w:val="single" w:color="BBBBBB" w:sz="4"/>
-              <w:left w:val="single" w:color="BBBBBB" w:sz="4"/>
-              <w:bottom w:val="single" w:color="BBBBBB" w:sz="4"/>
-              <w:right w:val="single" w:color="BBBBBB" w:sz="4"/>
-            </w:tcBorders>
-            <w:shd w:fill="FBE3E3" w:color="auto" w:val="clear"/>
-            <w:tcMar>
-              <w:top w:type="dxa" w:w="40"/>
-              <w:left w:type="dxa" w:w="80"/>
-              <w:bottom w:type="dxa" w:w="40"/>
-              <w:right w:type="dxa" w:w="80"/>
-            </w:tcMar>
-          </w:tcPr>
-          <w:p>
-            <w:pPr>
-              <w:jc w:val="right"/>
-            </w:pPr>
-            <w:r>
-              <w:rPr>
-                <w:rFonts w:ascii="Arial" w:eastAsia="Yu Gothic" w:hAnsi="Arial"/>
-                <w:b w:val="false"/>
-                <w:bCs w:val="false"/>
-                <w:sz w:val="16"/>
-                <w:szCs w:val="16"/>
-              </w:rPr>
-              <w:t xml:space="preserve">—</w:t>
-            </w:r>
-          </w:p>
-        </w:tc>
-        <w:tc>
-          <w:tcPr>
-            <w:tcW w:type="dxa" w:w="720"/>
-            <w:tcBorders>
-              <w:top w:val="single" w:color="BBBBBB" w:sz="4"/>
-              <w:left w:val="single" w:color="BBBBBB" w:sz="4"/>
-              <w:bottom w:val="single" w:color="BBBBBB" w:sz="4"/>
-              <w:right w:val="single" w:color="BBBBBB" w:sz="4"/>
-            </w:tcBorders>
-            <w:shd w:fill="FBE3E3" w:color="auto" w:val="clear"/>
-            <w:tcMar>
-              <w:top w:type="dxa" w:w="40"/>
-              <w:left w:type="dxa" w:w="80"/>
-              <w:bottom w:type="dxa" w:w="40"/>
-              <w:right w:type="dxa" w:w="80"/>
-            </w:tcMar>
-          </w:tcPr>
-          <w:p>
-            <w:pPr>
-              <w:jc w:val="right"/>
-            </w:pPr>
-            <w:r>
-              <w:rPr>
-                <w:rFonts w:ascii="Arial" w:eastAsia="Yu Gothic" w:hAnsi="Arial"/>
-                <w:b w:val="false"/>
-                <w:bCs w:val="false"/>
-                <w:sz w:val="16"/>
-                <w:szCs w:val="16"/>
-              </w:rPr>
-              <w:t xml:space="preserve">—</w:t>
-            </w:r>
-          </w:p>
-        </w:tc>
-        <w:tc>
-          <w:tcPr>
-            <w:tcW w:type="dxa" w:w="720"/>
-            <w:tcBorders>
-              <w:top w:val="single" w:color="BBBBBB" w:sz="4"/>
-              <w:left w:val="single" w:color="BBBBBB" w:sz="4"/>
-              <w:bottom w:val="single" w:color="BBBBBB" w:sz="4"/>
-              <w:right w:val="single" w:color="BBBBBB" w:sz="4"/>
-            </w:tcBorders>
-            <w:shd w:fill="FBE3E3" w:color="auto" w:val="clear"/>
-            <w:tcMar>
-              <w:top w:type="dxa" w:w="40"/>
-              <w:left w:type="dxa" w:w="80"/>
-              <w:bottom w:type="dxa" w:w="40"/>
-              <w:right w:type="dxa" w:w="80"/>
-            </w:tcMar>
-          </w:tcPr>
-          <w:p>
-            <w:pPr>
-              <w:jc w:val="right"/>
-            </w:pPr>
-            <w:r>
-              <w:rPr>
-                <w:rFonts w:ascii="Arial" w:eastAsia="Yu Gothic" w:hAnsi="Arial"/>
-                <w:b w:val="false"/>
-                <w:bCs w:val="false"/>
-                <w:sz w:val="16"/>
-                <w:szCs w:val="16"/>
-              </w:rPr>
-              <w:t xml:space="preserve">—</w:t>
-            </w:r>
-          </w:p>
-        </w:tc>
-        <w:tc>
-          <w:tcPr>
-            <w:tcW w:type="dxa" w:w="720"/>
-            <w:tcBorders>
-              <w:top w:val="single" w:color="BBBBBB" w:sz="4"/>
-              <w:left w:val="single" w:color="BBBBBB" w:sz="4"/>
-              <w:bottom w:val="single" w:color="BBBBBB" w:sz="4"/>
-              <w:right w:val="single" w:color="BBBBBB" w:sz="4"/>
-            </w:tcBorders>
-            <w:shd w:fill="FBE3E3" w:color="auto" w:val="clear"/>
-            <w:tcMar>
-              <w:top w:type="dxa" w:w="40"/>
-              <w:left w:type="dxa" w:w="80"/>
-              <w:bottom w:type="dxa" w:w="40"/>
-              <w:right w:type="dxa" w:w="80"/>
-            </w:tcMar>
-          </w:tcPr>
-          <w:p>
-            <w:pPr>
-              <w:jc w:val="right"/>
-            </w:pPr>
-            <w:r>
-              <w:rPr>
-                <w:rFonts w:ascii="Arial" w:eastAsia="Yu Gothic" w:hAnsi="Arial"/>
-                <w:b w:val="false"/>
-                <w:bCs w:val="false"/>
-                <w:sz w:val="16"/>
-                <w:szCs w:val="16"/>
-              </w:rPr>
-              <w:t xml:space="preserve">—</w:t>
-            </w:r>
-          </w:p>
-        </w:tc>
-        <w:tc>
-          <w:tcPr>
-            <w:tcW w:type="dxa" w:w="720"/>
-            <w:tcBorders>
-              <w:top w:val="single" w:color="BBBBBB" w:sz="4"/>
-              <w:left w:val="single" w:color="BBBBBB" w:sz="4"/>
-              <w:bottom w:val="single" w:color="BBBBBB" w:sz="4"/>
-              <w:right w:val="single" w:color="BBBBBB" w:sz="4"/>
-            </w:tcBorders>
-            <w:shd w:fill="FBE3E3" w:color="auto" w:val="clear"/>
+            <w:tcMar>
+              <w:top w:type="dxa" w:w="40"/>
+              <w:left w:type="dxa" w:w="80"/>
+              <w:bottom w:type="dxa" w:w="40"/>
+              <w:right w:type="dxa" w:w="80"/>
+            </w:tcMar>
+          </w:tcPr>
+          <w:p>
+            <w:pPr>
+              <w:jc w:val="right"/>
+            </w:pPr>
+            <w:r>
+              <w:rPr>
+                <w:rFonts w:ascii="Arial" w:eastAsia="Yu Gothic" w:hAnsi="Arial"/>
+                <w:b w:val="false"/>
+                <w:bCs w:val="false"/>
+                <w:sz w:val="16"/>
+                <w:szCs w:val="16"/>
+              </w:rPr>
+              <w:t xml:space="preserve">—</w:t>
+            </w:r>
+          </w:p>
+        </w:tc>
+        <w:tc>
+          <w:tcPr>
+            <w:tcW w:type="dxa" w:w="720"/>
+            <w:tcBorders>
+              <w:top w:val="single" w:color="BBBBBB" w:sz="4"/>
+              <w:left w:val="single" w:color="BBBBBB" w:sz="4"/>
+              <w:bottom w:val="single" w:color="BBBBBB" w:sz="4"/>
+              <w:right w:val="single" w:color="BBBBBB" w:sz="4"/>
+            </w:tcBorders>
+            <w:tcMar>
+              <w:top w:type="dxa" w:w="40"/>
+              <w:left w:type="dxa" w:w="80"/>
+              <w:bottom w:type="dxa" w:w="40"/>
+              <w:right w:type="dxa" w:w="80"/>
+            </w:tcMar>
+          </w:tcPr>
+          <w:p>
+            <w:pPr>
+              <w:jc w:val="right"/>
+            </w:pPr>
+            <w:r>
+              <w:rPr>
+                <w:rFonts w:ascii="Arial" w:eastAsia="Yu Gothic" w:hAnsi="Arial"/>
+                <w:b w:val="false"/>
+                <w:bCs w:val="false"/>
+                <w:sz w:val="16"/>
+                <w:szCs w:val="16"/>
+              </w:rPr>
+              <w:t xml:space="preserve">—</w:t>
+            </w:r>
+          </w:p>
+        </w:tc>
+        <w:tc>
+          <w:tcPr>
+            <w:tcW w:type="dxa" w:w="720"/>
+            <w:tcBorders>
+              <w:top w:val="single" w:color="BBBBBB" w:sz="4"/>
+              <w:left w:val="single" w:color="BBBBBB" w:sz="4"/>
+              <w:bottom w:val="single" w:color="BBBBBB" w:sz="4"/>
+              <w:right w:val="single" w:color="BBBBBB" w:sz="4"/>
+            </w:tcBorders>
+            <w:tcMar>
+              <w:top w:type="dxa" w:w="40"/>
+              <w:left w:type="dxa" w:w="80"/>
+              <w:bottom w:type="dxa" w:w="40"/>
+              <w:right w:type="dxa" w:w="80"/>
+            </w:tcMar>
+          </w:tcPr>
+          <w:p>
+            <w:pPr>
+              <w:jc w:val="right"/>
+            </w:pPr>
+            <w:r>
+              <w:rPr>
+                <w:rFonts w:ascii="Arial" w:eastAsia="Yu Gothic" w:hAnsi="Arial"/>
+                <w:b w:val="false"/>
+                <w:bCs w:val="false"/>
+                <w:sz w:val="16"/>
+                <w:szCs w:val="16"/>
+              </w:rPr>
+              <w:t xml:space="preserve">—</w:t>
+            </w:r>
+          </w:p>
+        </w:tc>
+        <w:tc>
+          <w:tcPr>
+            <w:tcW w:type="dxa" w:w="720"/>
+            <w:tcBorders>
+              <w:top w:val="single" w:color="BBBBBB" w:sz="4"/>
+              <w:left w:val="single" w:color="BBBBBB" w:sz="4"/>
+              <w:bottom w:val="single" w:color="BBBBBB" w:sz="4"/>
+              <w:right w:val="single" w:color="BBBBBB" w:sz="4"/>
+            </w:tcBorders>
+            <w:tcMar>
+              <w:top w:type="dxa" w:w="40"/>
+              <w:left w:type="dxa" w:w="80"/>
+              <w:bottom w:type="dxa" w:w="40"/>
+              <w:right w:type="dxa" w:w="80"/>
+            </w:tcMar>
+          </w:tcPr>
+          <w:p>
+            <w:pPr>
+              <w:jc w:val="right"/>
+            </w:pPr>
+            <w:r>
+              <w:rPr>
+                <w:rFonts w:ascii="Arial" w:eastAsia="Yu Gothic" w:hAnsi="Arial"/>
+                <w:b w:val="false"/>
+                <w:bCs w:val="false"/>
+                <w:sz w:val="16"/>
+                <w:szCs w:val="16"/>
+              </w:rPr>
+              <w:t xml:space="preserve">—</w:t>
+            </w:r>
+          </w:p>
+        </w:tc>
+        <w:tc>
+          <w:tcPr>
+            <w:tcW w:type="dxa" w:w="720"/>
+            <w:tcBorders>
+              <w:top w:val="single" w:color="BBBBBB" w:sz="4"/>
+              <w:left w:val="single" w:color="BBBBBB" w:sz="4"/>
+              <w:bottom w:val="single" w:color="BBBBBB" w:sz="4"/>
+              <w:right w:val="single" w:color="BBBBBB" w:sz="4"/>
+            </w:tcBorders>
+            <w:tcMar>
+              <w:top w:type="dxa" w:w="40"/>
+              <w:left w:type="dxa" w:w="80"/>
+              <w:bottom w:type="dxa" w:w="40"/>
+              <w:right w:type="dxa" w:w="80"/>
+            </w:tcMar>
+          </w:tcPr>
+          <w:p>
+            <w:pPr>
+              <w:jc w:val="right"/>
+            </w:pPr>
+            <w:r>
+              <w:rPr>
+                <w:rFonts w:ascii="Arial" w:eastAsia="Yu Gothic" w:hAnsi="Arial"/>
+                <w:b w:val="false"/>
+                <w:bCs w:val="false"/>
+                <w:sz w:val="16"/>
+                <w:szCs w:val="16"/>
+              </w:rPr>
+              <w:t xml:space="preserve">780</w:t>
+            </w:r>
+          </w:p>
+        </w:tc>
+        <w:tc>
+          <w:tcPr>
+            <w:tcW w:type="dxa" w:w="720"/>
+            <w:tcBorders>
+              <w:top w:val="single" w:color="BBBBBB" w:sz="4"/>
+              <w:left w:val="single" w:color="BBBBBB" w:sz="4"/>
+              <w:bottom w:val="single" w:color="BBBBBB" w:sz="4"/>
+              <w:right w:val="single" w:color="BBBBBB" w:sz="4"/>
+            </w:tcBorders>
             <w:tcMar>
               <w:top w:type="dxa" w:w="40"/>
               <w:left w:type="dxa" w:w="80"/>
@@ -17805,7 +17565,6 @@
               <w:bottom w:val="single" w:color="BBBBBB" w:sz="4"/>
               <w:right w:val="single" w:color="BBBBBB" w:sz="4"/>
             </w:tcBorders>
-            <w:shd w:fill="FBE3E3" w:color="auto" w:val="clear"/>
             <w:tcMar>
               <w:top w:type="dxa" w:w="40"/>
               <w:left w:type="dxa" w:w="80"/>
@@ -17838,27 +17597,26 @@
               <w:bottom w:val="single" w:color="BBBBBB" w:sz="4"/>
               <w:right w:val="single" w:color="BBBBBB" w:sz="4"/>
             </w:tcBorders>
-            <w:shd w:fill="FBE3E3" w:color="auto" w:val="clear"/>
-            <w:tcMar>
-              <w:top w:type="dxa" w:w="40"/>
-              <w:left w:type="dxa" w:w="80"/>
-              <w:bottom w:type="dxa" w:w="40"/>
-              <w:right w:type="dxa" w:w="80"/>
-            </w:tcMar>
-          </w:tcPr>
-          <w:p>
-            <w:pPr>
-              <w:jc w:val="right"/>
-            </w:pPr>
-            <w:r>
-              <w:rPr>
-                <w:rFonts w:ascii="Arial" w:eastAsia="Yu Gothic" w:hAnsi="Arial"/>
-                <w:b w:val="false"/>
-                <w:bCs w:val="false"/>
-                <w:sz w:val="16"/>
-                <w:szCs w:val="16"/>
-              </w:rPr>
-              <w:t xml:space="preserve">15,700</w:t>
+            <w:tcMar>
+              <w:top w:type="dxa" w:w="40"/>
+              <w:left w:type="dxa" w:w="80"/>
+              <w:bottom w:type="dxa" w:w="40"/>
+              <w:right w:type="dxa" w:w="80"/>
+            </w:tcMar>
+          </w:tcPr>
+          <w:p>
+            <w:pPr>
+              <w:jc w:val="right"/>
+            </w:pPr>
+            <w:r>
+              <w:rPr>
+                <w:rFonts w:ascii="Arial" w:eastAsia="Yu Gothic" w:hAnsi="Arial"/>
+                <w:b w:val="false"/>
+                <w:bCs w:val="false"/>
+                <w:sz w:val="16"/>
+                <w:szCs w:val="16"/>
+              </w:rPr>
+              <w:t xml:space="preserve">16,480</w:t>
             </w:r>
           </w:p>
         </w:tc>
@@ -17871,27 +17629,26 @@
               <w:bottom w:val="single" w:color="BBBBBB" w:sz="4"/>
               <w:right w:val="single" w:color="BBBBBB" w:sz="4"/>
             </w:tcBorders>
-            <w:shd w:fill="FBE3E3" w:color="auto" w:val="clear"/>
-            <w:tcMar>
-              <w:top w:type="dxa" w:w="40"/>
-              <w:left w:type="dxa" w:w="80"/>
-              <w:bottom w:type="dxa" w:w="40"/>
-              <w:right w:type="dxa" w:w="80"/>
-            </w:tcMar>
-          </w:tcPr>
-          <w:p>
-            <w:pPr>
-              <w:jc w:val="right"/>
-            </w:pPr>
-            <w:r>
-              <w:rPr>
-                <w:rFonts w:ascii="Arial" w:eastAsia="Yu Gothic" w:hAnsi="Arial"/>
-                <w:b w:val="false"/>
-                <w:bCs w:val="false"/>
-                <w:sz w:val="16"/>
-                <w:szCs w:val="16"/>
-              </w:rPr>
-              <w:t xml:space="preserve">200</w:t>
+            <w:tcMar>
+              <w:top w:type="dxa" w:w="40"/>
+              <w:left w:type="dxa" w:w="80"/>
+              <w:bottom w:type="dxa" w:w="40"/>
+              <w:right w:type="dxa" w:w="80"/>
+            </w:tcMar>
+          </w:tcPr>
+          <w:p>
+            <w:pPr>
+              <w:jc w:val="right"/>
+            </w:pPr>
+            <w:r>
+              <w:rPr>
+                <w:rFonts w:ascii="Arial" w:eastAsia="Yu Gothic" w:hAnsi="Arial"/>
+                <w:b w:val="false"/>
+                <w:bCs w:val="false"/>
+                <w:sz w:val="16"/>
+                <w:szCs w:val="16"/>
+              </w:rPr>
+              <w:t xml:space="preserve">560</w:t>
             </w:r>
           </w:p>
         </w:tc>
@@ -17904,7 +17661,6 @@
               <w:bottom w:val="single" w:color="BBBBBB" w:sz="4"/>
               <w:right w:val="single" w:color="BBBBBB" w:sz="4"/>
             </w:tcBorders>
-            <w:shd w:fill="FBE3E3" w:color="auto" w:val="clear"/>
             <w:tcMar>
               <w:top w:type="dxa" w:w="40"/>
               <w:left w:type="dxa" w:w="80"/>
@@ -17924,7 +17680,7 @@
                 <w:sz w:val="16"/>
                 <w:szCs w:val="16"/>
               </w:rPr>
-              <w:t xml:space="preserve">Ghana 1 200</w:t>
+              <w:t xml:space="preserve">Ghana 1 560</w:t>
             </w:r>
           </w:p>
         </w:tc>
@@ -17939,7 +17695,6 @@
               <w:bottom w:val="single" w:color="BBBBBB" w:sz="4"/>
               <w:right w:val="single" w:color="BBBBBB" w:sz="4"/>
             </w:tcBorders>
-            <w:shd w:fill="FBE3E3" w:color="auto" w:val="clear"/>
             <w:tcMar>
               <w:top w:type="dxa" w:w="40"/>
               <w:left w:type="dxa" w:w="80"/>
@@ -17972,172 +17727,166 @@
               <w:bottom w:val="single" w:color="BBBBBB" w:sz="4"/>
               <w:right w:val="single" w:color="BBBBBB" w:sz="4"/>
             </w:tcBorders>
-            <w:shd w:fill="FBE3E3" w:color="auto" w:val="clear"/>
-            <w:tcMar>
-              <w:top w:type="dxa" w:w="40"/>
-              <w:left w:type="dxa" w:w="80"/>
-              <w:bottom w:type="dxa" w:w="40"/>
-              <w:right w:type="dxa" w:w="80"/>
-            </w:tcMar>
-          </w:tcPr>
-          <w:p>
-            <w:pPr>
-              <w:jc w:val="right"/>
-            </w:pPr>
-            <w:r>
-              <w:rPr>
-                <w:rFonts w:ascii="Arial" w:eastAsia="Yu Gothic" w:hAnsi="Arial"/>
-                <w:b w:val="false"/>
-                <w:bCs w:val="false"/>
-                <w:sz w:val="16"/>
-                <w:szCs w:val="16"/>
-              </w:rPr>
-              <w:t xml:space="preserve">—</w:t>
-            </w:r>
-          </w:p>
-        </w:tc>
-        <w:tc>
-          <w:tcPr>
-            <w:tcW w:type="dxa" w:w="720"/>
-            <w:tcBorders>
-              <w:top w:val="single" w:color="BBBBBB" w:sz="4"/>
-              <w:left w:val="single" w:color="BBBBBB" w:sz="4"/>
-              <w:bottom w:val="single" w:color="BBBBBB" w:sz="4"/>
-              <w:right w:val="single" w:color="BBBBBB" w:sz="4"/>
-            </w:tcBorders>
-            <w:shd w:fill="FBE3E3" w:color="auto" w:val="clear"/>
-            <w:tcMar>
-              <w:top w:type="dxa" w:w="40"/>
-              <w:left w:type="dxa" w:w="80"/>
-              <w:bottom w:type="dxa" w:w="40"/>
-              <w:right w:type="dxa" w:w="80"/>
-            </w:tcMar>
-          </w:tcPr>
-          <w:p>
-            <w:pPr>
-              <w:jc w:val="right"/>
-            </w:pPr>
-            <w:r>
-              <w:rPr>
-                <w:rFonts w:ascii="Arial" w:eastAsia="Yu Gothic" w:hAnsi="Arial"/>
-                <w:b w:val="false"/>
-                <w:bCs w:val="false"/>
-                <w:sz w:val="16"/>
-                <w:szCs w:val="16"/>
-              </w:rPr>
-              <w:t xml:space="preserve">—</w:t>
-            </w:r>
-          </w:p>
-        </w:tc>
-        <w:tc>
-          <w:tcPr>
-            <w:tcW w:type="dxa" w:w="720"/>
-            <w:tcBorders>
-              <w:top w:val="single" w:color="BBBBBB" w:sz="4"/>
-              <w:left w:val="single" w:color="BBBBBB" w:sz="4"/>
-              <w:bottom w:val="single" w:color="BBBBBB" w:sz="4"/>
-              <w:right w:val="single" w:color="BBBBBB" w:sz="4"/>
-            </w:tcBorders>
-            <w:shd w:fill="FBE3E3" w:color="auto" w:val="clear"/>
-            <w:tcMar>
-              <w:top w:type="dxa" w:w="40"/>
-              <w:left w:type="dxa" w:w="80"/>
-              <w:bottom w:type="dxa" w:w="40"/>
-              <w:right w:type="dxa" w:w="80"/>
-            </w:tcMar>
-          </w:tcPr>
-          <w:p>
-            <w:pPr>
-              <w:jc w:val="right"/>
-            </w:pPr>
-            <w:r>
-              <w:rPr>
-                <w:rFonts w:ascii="Arial" w:eastAsia="Yu Gothic" w:hAnsi="Arial"/>
-                <w:b w:val="false"/>
-                <w:bCs w:val="false"/>
-                <w:sz w:val="16"/>
-                <w:szCs w:val="16"/>
-              </w:rPr>
-              <w:t xml:space="preserve">—</w:t>
-            </w:r>
-          </w:p>
-        </w:tc>
-        <w:tc>
-          <w:tcPr>
-            <w:tcW w:type="dxa" w:w="720"/>
-            <w:tcBorders>
-              <w:top w:val="single" w:color="BBBBBB" w:sz="4"/>
-              <w:left w:val="single" w:color="BBBBBB" w:sz="4"/>
-              <w:bottom w:val="single" w:color="BBBBBB" w:sz="4"/>
-              <w:right w:val="single" w:color="BBBBBB" w:sz="4"/>
-            </w:tcBorders>
-            <w:shd w:fill="FBE3E3" w:color="auto" w:val="clear"/>
-            <w:tcMar>
-              <w:top w:type="dxa" w:w="40"/>
-              <w:left w:type="dxa" w:w="80"/>
-              <w:bottom w:type="dxa" w:w="40"/>
-              <w:right w:type="dxa" w:w="80"/>
-            </w:tcMar>
-          </w:tcPr>
-          <w:p>
-            <w:pPr>
-              <w:jc w:val="right"/>
-            </w:pPr>
-            <w:r>
-              <w:rPr>
-                <w:rFonts w:ascii="Arial" w:eastAsia="Yu Gothic" w:hAnsi="Arial"/>
-                <w:b w:val="false"/>
-                <w:bCs w:val="false"/>
-                <w:sz w:val="16"/>
-                <w:szCs w:val="16"/>
-              </w:rPr>
-              <w:t xml:space="preserve">—</w:t>
-            </w:r>
-          </w:p>
-        </w:tc>
-        <w:tc>
-          <w:tcPr>
-            <w:tcW w:type="dxa" w:w="720"/>
-            <w:tcBorders>
-              <w:top w:val="single" w:color="BBBBBB" w:sz="4"/>
-              <w:left w:val="single" w:color="BBBBBB" w:sz="4"/>
-              <w:bottom w:val="single" w:color="BBBBBB" w:sz="4"/>
-              <w:right w:val="single" w:color="BBBBBB" w:sz="4"/>
-            </w:tcBorders>
-            <w:shd w:fill="FBE3E3" w:color="auto" w:val="clear"/>
-            <w:tcMar>
-              <w:top w:type="dxa" w:w="40"/>
-              <w:left w:type="dxa" w:w="80"/>
-              <w:bottom w:type="dxa" w:w="40"/>
-              <w:right w:type="dxa" w:w="80"/>
-            </w:tcMar>
-          </w:tcPr>
-          <w:p>
-            <w:pPr>
-              <w:jc w:val="right"/>
-            </w:pPr>
-            <w:r>
-              <w:rPr>
-                <w:rFonts w:ascii="Arial" w:eastAsia="Yu Gothic" w:hAnsi="Arial"/>
-                <w:b w:val="false"/>
-                <w:bCs w:val="false"/>
-                <w:sz w:val="16"/>
-                <w:szCs w:val="16"/>
-              </w:rPr>
-              <w:t xml:space="preserve">—</w:t>
-            </w:r>
-          </w:p>
-        </w:tc>
-        <w:tc>
-          <w:tcPr>
-            <w:tcW w:type="dxa" w:w="720"/>
-            <w:tcBorders>
-              <w:top w:val="single" w:color="BBBBBB" w:sz="4"/>
-              <w:left w:val="single" w:color="BBBBBB" w:sz="4"/>
-              <w:bottom w:val="single" w:color="BBBBBB" w:sz="4"/>
-              <w:right w:val="single" w:color="BBBBBB" w:sz="4"/>
-            </w:tcBorders>
-            <w:shd w:fill="FBE3E3" w:color="auto" w:val="clear"/>
+            <w:tcMar>
+              <w:top w:type="dxa" w:w="40"/>
+              <w:left w:type="dxa" w:w="80"/>
+              <w:bottom w:type="dxa" w:w="40"/>
+              <w:right w:type="dxa" w:w="80"/>
+            </w:tcMar>
+          </w:tcPr>
+          <w:p>
+            <w:pPr>
+              <w:jc w:val="right"/>
+            </w:pPr>
+            <w:r>
+              <w:rPr>
+                <w:rFonts w:ascii="Arial" w:eastAsia="Yu Gothic" w:hAnsi="Arial"/>
+                <w:b w:val="false"/>
+                <w:bCs w:val="false"/>
+                <w:sz w:val="16"/>
+                <w:szCs w:val="16"/>
+              </w:rPr>
+              <w:t xml:space="preserve">—</w:t>
+            </w:r>
+          </w:p>
+        </w:tc>
+        <w:tc>
+          <w:tcPr>
+            <w:tcW w:type="dxa" w:w="720"/>
+            <w:tcBorders>
+              <w:top w:val="single" w:color="BBBBBB" w:sz="4"/>
+              <w:left w:val="single" w:color="BBBBBB" w:sz="4"/>
+              <w:bottom w:val="single" w:color="BBBBBB" w:sz="4"/>
+              <w:right w:val="single" w:color="BBBBBB" w:sz="4"/>
+            </w:tcBorders>
+            <w:tcMar>
+              <w:top w:type="dxa" w:w="40"/>
+              <w:left w:type="dxa" w:w="80"/>
+              <w:bottom w:type="dxa" w:w="40"/>
+              <w:right w:type="dxa" w:w="80"/>
+            </w:tcMar>
+          </w:tcPr>
+          <w:p>
+            <w:pPr>
+              <w:jc w:val="right"/>
+            </w:pPr>
+            <w:r>
+              <w:rPr>
+                <w:rFonts w:ascii="Arial" w:eastAsia="Yu Gothic" w:hAnsi="Arial"/>
+                <w:b w:val="false"/>
+                <w:bCs w:val="false"/>
+                <w:sz w:val="16"/>
+                <w:szCs w:val="16"/>
+              </w:rPr>
+              <w:t xml:space="preserve">—</w:t>
+            </w:r>
+          </w:p>
+        </w:tc>
+        <w:tc>
+          <w:tcPr>
+            <w:tcW w:type="dxa" w:w="720"/>
+            <w:tcBorders>
+              <w:top w:val="single" w:color="BBBBBB" w:sz="4"/>
+              <w:left w:val="single" w:color="BBBBBB" w:sz="4"/>
+              <w:bottom w:val="single" w:color="BBBBBB" w:sz="4"/>
+              <w:right w:val="single" w:color="BBBBBB" w:sz="4"/>
+            </w:tcBorders>
+            <w:tcMar>
+              <w:top w:type="dxa" w:w="40"/>
+              <w:left w:type="dxa" w:w="80"/>
+              <w:bottom w:type="dxa" w:w="40"/>
+              <w:right w:type="dxa" w:w="80"/>
+            </w:tcMar>
+          </w:tcPr>
+          <w:p>
+            <w:pPr>
+              <w:jc w:val="right"/>
+            </w:pPr>
+            <w:r>
+              <w:rPr>
+                <w:rFonts w:ascii="Arial" w:eastAsia="Yu Gothic" w:hAnsi="Arial"/>
+                <w:b w:val="false"/>
+                <w:bCs w:val="false"/>
+                <w:sz w:val="16"/>
+                <w:szCs w:val="16"/>
+              </w:rPr>
+              <w:t xml:space="preserve">—</w:t>
+            </w:r>
+          </w:p>
+        </w:tc>
+        <w:tc>
+          <w:tcPr>
+            <w:tcW w:type="dxa" w:w="720"/>
+            <w:tcBorders>
+              <w:top w:val="single" w:color="BBBBBB" w:sz="4"/>
+              <w:left w:val="single" w:color="BBBBBB" w:sz="4"/>
+              <w:bottom w:val="single" w:color="BBBBBB" w:sz="4"/>
+              <w:right w:val="single" w:color="BBBBBB" w:sz="4"/>
+            </w:tcBorders>
+            <w:tcMar>
+              <w:top w:type="dxa" w:w="40"/>
+              <w:left w:type="dxa" w:w="80"/>
+              <w:bottom w:type="dxa" w:w="40"/>
+              <w:right w:type="dxa" w:w="80"/>
+            </w:tcMar>
+          </w:tcPr>
+          <w:p>
+            <w:pPr>
+              <w:jc w:val="right"/>
+            </w:pPr>
+            <w:r>
+              <w:rPr>
+                <w:rFonts w:ascii="Arial" w:eastAsia="Yu Gothic" w:hAnsi="Arial"/>
+                <w:b w:val="false"/>
+                <w:bCs w:val="false"/>
+                <w:sz w:val="16"/>
+                <w:szCs w:val="16"/>
+              </w:rPr>
+              <w:t xml:space="preserve">—</w:t>
+            </w:r>
+          </w:p>
+        </w:tc>
+        <w:tc>
+          <w:tcPr>
+            <w:tcW w:type="dxa" w:w="720"/>
+            <w:tcBorders>
+              <w:top w:val="single" w:color="BBBBBB" w:sz="4"/>
+              <w:left w:val="single" w:color="BBBBBB" w:sz="4"/>
+              <w:bottom w:val="single" w:color="BBBBBB" w:sz="4"/>
+              <w:right w:val="single" w:color="BBBBBB" w:sz="4"/>
+            </w:tcBorders>
+            <w:tcMar>
+              <w:top w:type="dxa" w:w="40"/>
+              <w:left w:type="dxa" w:w="80"/>
+              <w:bottom w:type="dxa" w:w="40"/>
+              <w:right w:type="dxa" w:w="80"/>
+            </w:tcMar>
+          </w:tcPr>
+          <w:p>
+            <w:pPr>
+              <w:jc w:val="right"/>
+            </w:pPr>
+            <w:r>
+              <w:rPr>
+                <w:rFonts w:ascii="Arial" w:eastAsia="Yu Gothic" w:hAnsi="Arial"/>
+                <w:b w:val="false"/>
+                <w:bCs w:val="false"/>
+                <w:sz w:val="16"/>
+                <w:szCs w:val="16"/>
+              </w:rPr>
+              <w:t xml:space="preserve">220</w:t>
+            </w:r>
+          </w:p>
+        </w:tc>
+        <w:tc>
+          <w:tcPr>
+            <w:tcW w:type="dxa" w:w="720"/>
+            <w:tcBorders>
+              <w:top w:val="single" w:color="BBBBBB" w:sz="4"/>
+              <w:left w:val="single" w:color="BBBBBB" w:sz="4"/>
+              <w:bottom w:val="single" w:color="BBBBBB" w:sz="4"/>
+              <w:right w:val="single" w:color="BBBBBB" w:sz="4"/>
+            </w:tcBorders>
             <w:tcMar>
               <w:top w:type="dxa" w:w="40"/>
               <w:left w:type="dxa" w:w="80"/>
@@ -18170,7 +17919,6 @@
               <w:bottom w:val="single" w:color="BBBBBB" w:sz="4"/>
               <w:right w:val="single" w:color="BBBBBB" w:sz="4"/>
             </w:tcBorders>
-            <w:shd w:fill="FBE3E3" w:color="auto" w:val="clear"/>
             <w:tcMar>
               <w:top w:type="dxa" w:w="40"/>
               <w:left w:type="dxa" w:w="80"/>
@@ -18203,27 +17951,26 @@
               <w:bottom w:val="single" w:color="BBBBBB" w:sz="4"/>
               <w:right w:val="single" w:color="BBBBBB" w:sz="4"/>
             </w:tcBorders>
-            <w:shd w:fill="FBE3E3" w:color="auto" w:val="clear"/>
-            <w:tcMar>
-              <w:top w:type="dxa" w:w="40"/>
-              <w:left w:type="dxa" w:w="80"/>
-              <w:bottom w:type="dxa" w:w="40"/>
-              <w:right w:type="dxa" w:w="80"/>
-            </w:tcMar>
-          </w:tcPr>
-          <w:p>
-            <w:pPr>
-              <w:jc w:val="right"/>
-            </w:pPr>
-            <w:r>
-              <w:rPr>
-                <w:rFonts w:ascii="Arial" w:eastAsia="Yu Gothic" w:hAnsi="Arial"/>
-                <w:b w:val="false"/>
-                <w:bCs w:val="false"/>
-                <w:sz w:val="16"/>
-                <w:szCs w:val="16"/>
-              </w:rPr>
-              <w:t xml:space="preserve">15,700</w:t>
+            <w:tcMar>
+              <w:top w:type="dxa" w:w="40"/>
+              <w:left w:type="dxa" w:w="80"/>
+              <w:bottom w:type="dxa" w:w="40"/>
+              <w:right w:type="dxa" w:w="80"/>
+            </w:tcMar>
+          </w:tcPr>
+          <w:p>
+            <w:pPr>
+              <w:jc w:val="right"/>
+            </w:pPr>
+            <w:r>
+              <w:rPr>
+                <w:rFonts w:ascii="Arial" w:eastAsia="Yu Gothic" w:hAnsi="Arial"/>
+                <w:b w:val="false"/>
+                <w:bCs w:val="false"/>
+                <w:sz w:val="16"/>
+                <w:szCs w:val="16"/>
+              </w:rPr>
+              <w:t xml:space="preserve">15,920</w:t>
             </w:r>
           </w:p>
         </w:tc>
@@ -18236,27 +17983,26 @@
               <w:bottom w:val="single" w:color="BBBBBB" w:sz="4"/>
               <w:right w:val="single" w:color="BBBBBB" w:sz="4"/>
             </w:tcBorders>
-            <w:shd w:fill="FBE3E3" w:color="auto" w:val="clear"/>
-            <w:tcMar>
-              <w:top w:type="dxa" w:w="40"/>
-              <w:left w:type="dxa" w:w="80"/>
-              <w:bottom w:type="dxa" w:w="40"/>
-              <w:right w:type="dxa" w:w="80"/>
-            </w:tcMar>
-          </w:tcPr>
-          <w:p>
-            <w:pPr>
-              <w:jc w:val="right"/>
-            </w:pPr>
-            <w:r>
-              <w:rPr>
-                <w:rFonts w:ascii="Arial" w:eastAsia="Yu Gothic" w:hAnsi="Arial"/>
-                <w:b w:val="false"/>
-                <w:bCs w:val="false"/>
-                <w:sz w:val="16"/>
-                <w:szCs w:val="16"/>
-              </w:rPr>
-              <w:t xml:space="preserve">0</w:t>
+            <w:tcMar>
+              <w:top w:type="dxa" w:w="40"/>
+              <w:left w:type="dxa" w:w="80"/>
+              <w:bottom w:type="dxa" w:w="40"/>
+              <w:right w:type="dxa" w:w="80"/>
+            </w:tcMar>
+          </w:tcPr>
+          <w:p>
+            <w:pPr>
+              <w:jc w:val="right"/>
+            </w:pPr>
+            <w:r>
+              <w:rPr>
+                <w:rFonts w:ascii="Arial" w:eastAsia="Yu Gothic" w:hAnsi="Arial"/>
+                <w:b w:val="false"/>
+                <w:bCs w:val="false"/>
+                <w:sz w:val="16"/>
+                <w:szCs w:val="16"/>
+              </w:rPr>
+              <w:t xml:space="preserve">560</w:t>
             </w:r>
           </w:p>
         </w:tc>
@@ -18269,27 +18015,26 @@
               <w:bottom w:val="single" w:color="BBBBBB" w:sz="4"/>
               <w:right w:val="single" w:color="BBBBBB" w:sz="4"/>
             </w:tcBorders>
-            <w:shd w:fill="FBE3E3" w:color="auto" w:val="clear"/>
-            <w:tcMar>
-              <w:top w:type="dxa" w:w="40"/>
-              <w:left w:type="dxa" w:w="80"/>
-              <w:bottom w:type="dxa" w:w="40"/>
-              <w:right w:type="dxa" w:w="80"/>
-            </w:tcMar>
-          </w:tcPr>
-          <w:p>
-            <w:pPr>
-              <w:jc w:val="right"/>
-            </w:pPr>
-            <w:r>
-              <w:rPr>
-                <w:rFonts w:ascii="Arial" w:eastAsia="Yu Gothic" w:hAnsi="Arial"/>
-                <w:b w:val="false"/>
-                <w:bCs w:val="false"/>
-                <w:sz w:val="16"/>
-                <w:szCs w:val="16"/>
-              </w:rPr>
-              <w:t xml:space="preserve">—</w:t>
+            <w:tcMar>
+              <w:top w:type="dxa" w:w="40"/>
+              <w:left w:type="dxa" w:w="80"/>
+              <w:bottom w:type="dxa" w:w="40"/>
+              <w:right w:type="dxa" w:w="80"/>
+            </w:tcMar>
+          </w:tcPr>
+          <w:p>
+            <w:pPr>
+              <w:jc w:val="left"/>
+            </w:pPr>
+            <w:r>
+              <w:rPr>
+                <w:rFonts w:ascii="Arial" w:eastAsia="Yu Gothic" w:hAnsi="Arial"/>
+                <w:b w:val="false"/>
+                <w:bCs w:val="false"/>
+                <w:sz w:val="16"/>
+                <w:szCs w:val="16"/>
+              </w:rPr>
+              <w:t xml:space="preserve">Ghana 1 560</w:t>
             </w:r>
           </w:p>
         </w:tc>
@@ -18621,7 +18366,7 @@
                 <w:sz w:val="16"/>
                 <w:szCs w:val="16"/>
               </w:rPr>
-              <w:t xml:space="preserve">0</w:t>
+              <w:t xml:space="preserve">220</w:t>
             </w:r>
           </w:p>
         </w:tc>
@@ -18644,17 +18389,17 @@
           </w:tcPr>
           <w:p>
             <w:pPr>
-              <w:jc w:val="right"/>
-            </w:pPr>
-            <w:r>
-              <w:rPr>
-                <w:rFonts w:ascii="Arial" w:eastAsia="Yu Gothic" w:hAnsi="Arial"/>
-                <w:b w:val="false"/>
-                <w:bCs w:val="false"/>
-                <w:sz w:val="16"/>
-                <w:szCs w:val="16"/>
-              </w:rPr>
-              <w:t xml:space="preserve">—</w:t>
+              <w:jc w:val="left"/>
+            </w:pPr>
+            <w:r>
+              <w:rPr>
+                <w:rFonts w:ascii="Arial" w:eastAsia="Yu Gothic" w:hAnsi="Arial"/>
+                <w:b w:val="false"/>
+                <w:bCs w:val="false"/>
+                <w:sz w:val="16"/>
+                <w:szCs w:val="16"/>
+              </w:rPr>
+              <w:t xml:space="preserve">Ghana 1 220</w:t>
             </w:r>
           </w:p>
         </w:tc>

</xml_diff>